<commit_message>
Ajustes de red 1.2
</commit_message>
<xml_diff>
--- a/fuentes/63560006_CFA01_DU.docx
+++ b/fuentes/63560006_CFA01_DU.docx
@@ -1708,13 +1708,7 @@
           </w:p>
           <w:p>
             <w:r>
-              <w:t>Una extracción ideal comienza a gotear entre 4 y 6 segundos después de accionar la bomba</w:t>
-            </w:r>
-            <w:r>
-              <w:t>; e</w:t>
-            </w:r>
-            <w:r>
-              <w:t>l flujo debe ser constante, como una cola de ratón, y detenerse entre 25 a 30 segundos.</w:t>
+              <w:t>Una extracción ideal comienza a gotear entre 4 y 6 segundos después de accionar la bomba; el flujo debe ser constante, como una cola de ratón, y detenerse entre 25 a 30 segundos.</w:t>
             </w:r>
           </w:p>
           <w:p>
@@ -1743,26 +1737,17 @@
           </w:p>
           <w:p>
             <w:r>
-              <w:t>Uno, d</w:t>
-            </w:r>
-            <w:r>
-              <w:t>iagnóstico visual del flujo y la crema.</w:t>
-            </w:r>
-          </w:p>
-          <w:p>
-            <w:r>
-              <w:t>Dos, a</w:t>
-            </w:r>
-            <w:r>
-              <w:t>juste del anillo de molienda.</w:t>
-            </w:r>
-          </w:p>
-          <w:p>
-            <w:r>
-              <w:t>Tres, v</w:t>
-            </w:r>
-            <w:r>
-              <w:t>erificación con balanza y cronómetro.</w:t>
+              <w:t>Uno, diagnóstico visual del flujo y la crema.</w:t>
+            </w:r>
+          </w:p>
+          <w:p>
+            <w:r>
+              <w:t>Dos, ajuste del anillo de molienda.</w:t>
+            </w:r>
+          </w:p>
+          <w:p>
+            <w:r>
+              <w:t>Tres, verificación con balanza y cronómetro.</w:t>
             </w:r>
           </w:p>
           <w:p>
@@ -1776,13 +1761,7 @@
               <w:t>espresso</w:t>
             </w:r>
             <w:r>
-              <w:t xml:space="preserve"> sea una obra de arte reproducible</w:t>
-            </w:r>
-            <w:r>
-              <w:t>, p</w:t>
-            </w:r>
-            <w:r>
-              <w:t>ractique y registre sus ajustes.</w:t>
+              <w:t xml:space="preserve"> sea una obra de arte reproducible, practique y registre sus ajustes.</w:t>
             </w:r>
           </w:p>
           <w:p/>
@@ -1795,6 +1774,7 @@
         <w:ind w:firstLine="0"/>
       </w:pPr>
       <w:r>
+        <w:lastRenderedPageBreak/>
         <w:br w:type="page"/>
       </w:r>
     </w:p>
@@ -8447,133 +8427,6 @@
           <w:bCs/>
           <w:lang w:val="es-419" w:eastAsia="es-CO"/>
         </w:rPr>
-        <w:t>Equipos y utensilios alternativos para la elaboración del café:</w:t>
-      </w:r>
-    </w:p>
-    <w:p>
-      <w:pPr>
-        <w:pStyle w:val="Prrafodelista"/>
-        <w:numPr>
-          <w:ilvl w:val="0"/>
-          <w:numId w:val="21"/>
-        </w:numPr>
-        <w:rPr>
-          <w:lang w:val="es-419" w:eastAsia="es-CO"/>
-        </w:rPr>
-      </w:pPr>
-      <w:r>
-        <w:rPr>
-          <w:rStyle w:val="Extranjerismo"/>
-          <w:lang w:val="es-419" w:eastAsia="es-CO"/>
-        </w:rPr>
-        <w:t>Pour over</w:t>
-      </w:r>
-      <w:r>
-        <w:rPr>
-          <w:lang w:val="es-419" w:eastAsia="es-CO"/>
-        </w:rPr>
-        <w:t xml:space="preserve"> (V60, Chemex, Kalita Wave).</w:t>
-      </w:r>
-    </w:p>
-    <w:p>
-      <w:pPr>
-        <w:pStyle w:val="Prrafodelista"/>
-        <w:numPr>
-          <w:ilvl w:val="0"/>
-          <w:numId w:val="21"/>
-        </w:numPr>
-        <w:rPr>
-          <w:lang w:val="es-419" w:eastAsia="es-CO"/>
-        </w:rPr>
-      </w:pPr>
-      <w:r>
-        <w:rPr>
-          <w:lang w:val="es-419" w:eastAsia="es-CO"/>
-        </w:rPr>
-        <w:t>Prensa francesa.</w:t>
-      </w:r>
-    </w:p>
-    <w:p>
-      <w:pPr>
-        <w:pStyle w:val="Prrafodelista"/>
-        <w:numPr>
-          <w:ilvl w:val="0"/>
-          <w:numId w:val="21"/>
-        </w:numPr>
-        <w:rPr>
-          <w:lang w:val="es-419" w:eastAsia="es-CO"/>
-        </w:rPr>
-      </w:pPr>
-      <w:r>
-        <w:rPr>
-          <w:lang w:val="es-419" w:eastAsia="es-CO"/>
-        </w:rPr>
-        <w:t>Aeropress.</w:t>
-      </w:r>
-    </w:p>
-    <w:p>
-      <w:pPr>
-        <w:pStyle w:val="Prrafodelista"/>
-        <w:numPr>
-          <w:ilvl w:val="0"/>
-          <w:numId w:val="21"/>
-        </w:numPr>
-        <w:rPr>
-          <w:lang w:val="es-419" w:eastAsia="es-CO"/>
-        </w:rPr>
-      </w:pPr>
-      <w:r>
-        <w:rPr>
-          <w:lang w:val="es-419" w:eastAsia="es-CO"/>
-        </w:rPr>
-        <w:t>Sifón japonés.</w:t>
-      </w:r>
-    </w:p>
-    <w:p>
-      <w:pPr>
-        <w:pStyle w:val="Prrafodelista"/>
-        <w:numPr>
-          <w:ilvl w:val="0"/>
-          <w:numId w:val="21"/>
-        </w:numPr>
-        <w:rPr>
-          <w:lang w:val="es-419" w:eastAsia="es-CO"/>
-        </w:rPr>
-      </w:pPr>
-      <w:r>
-        <w:rPr>
-          <w:lang w:val="es-419" w:eastAsia="es-CO"/>
-        </w:rPr>
-        <w:t xml:space="preserve">Cafetera </w:t>
-      </w:r>
-      <w:r>
-        <w:rPr>
-          <w:rStyle w:val="Extranjerismo"/>
-          <w:lang w:val="es-419" w:eastAsia="es-CO"/>
-        </w:rPr>
-        <w:t>moka</w:t>
-      </w:r>
-      <w:r>
-        <w:rPr>
-          <w:lang w:val="es-419" w:eastAsia="es-CO"/>
-        </w:rPr>
-        <w:t xml:space="preserve"> (greca).</w:t>
-      </w:r>
-    </w:p>
-    <w:p>
-      <w:pPr>
-        <w:rPr>
-          <w:b/>
-          <w:bCs/>
-          <w:lang w:val="es-419" w:eastAsia="es-CO"/>
-        </w:rPr>
-      </w:pPr>
-      <w:r>
-        <w:rPr>
-          <w:b/>
-          <w:bCs/>
-          <w:lang w:val="es-419" w:eastAsia="es-CO"/>
-        </w:rPr>
         <w:t>Mantenimiento básico y rutinas de limpieza</w:t>
       </w:r>
     </w:p>
@@ -8601,7 +8454,6 @@
         <w:rPr>
           <w:lang w:val="es-419" w:eastAsia="es-CO"/>
         </w:rPr>
-        <w:lastRenderedPageBreak/>
         <w:t>Rutina de mantenimiento de equipos</w:t>
       </w:r>
     </w:p>
@@ -8807,6 +8659,7 @@
               <w:pStyle w:val="TextoTablas"/>
             </w:pPr>
             <w:r>
+              <w:lastRenderedPageBreak/>
               <w:t>Lanza de vapor</w:t>
             </w:r>
           </w:p>
@@ -9278,34 +9131,18 @@
     </w:p>
     <w:p>
       <w:pPr>
-        <w:spacing w:before="0" w:after="160" w:line="259" w:lineRule="auto"/>
-        <w:ind w:firstLine="0"/>
-        <w:rPr>
-          <w:lang w:val="es-419" w:eastAsia="es-CO"/>
-        </w:rPr>
-      </w:pPr>
-      <w:r>
-        <w:rPr>
-          <w:lang w:val="es-419" w:eastAsia="es-CO"/>
-        </w:rPr>
-        <w:br w:type="page"/>
-      </w:r>
-    </w:p>
-    <w:p>
-      <w:pPr>
-        <w:rPr>
-          <w:b/>
-          <w:bCs/>
-          <w:lang w:val="es-419" w:eastAsia="es-CO"/>
-        </w:rPr>
-      </w:pPr>
-      <w:r>
-        <w:rPr>
-          <w:b/>
-          <w:bCs/>
-          <w:lang w:val="es-419" w:eastAsia="es-CO"/>
-        </w:rPr>
-        <w:lastRenderedPageBreak/>
+        <w:rPr>
+          <w:b/>
+          <w:bCs/>
+          <w:lang w:val="es-419" w:eastAsia="es-CO"/>
+        </w:rPr>
+      </w:pPr>
+      <w:r>
+        <w:rPr>
+          <w:b/>
+          <w:bCs/>
+          <w:lang w:val="es-419" w:eastAsia="es-CO"/>
+        </w:rPr>
         <w:t xml:space="preserve">Procedimiento de </w:t>
       </w:r>
       <w:r>
@@ -9446,6 +9283,7 @@
         <w:rPr>
           <w:lang w:val="es-419" w:eastAsia="es-CO"/>
         </w:rPr>
+        <w:lastRenderedPageBreak/>
         <w:t>Repetir el ciclo</w:t>
       </w:r>
       <w:r>
@@ -9476,14 +9314,7 @@
         <w:rPr>
           <w:lang w:val="es-419" w:eastAsia="es-CO"/>
         </w:rPr>
-        <w:t xml:space="preserve">Enjuague </w:t>
-      </w:r>
-      <w:proofErr w:type="gramStart"/>
-      <w:r>
-        <w:rPr>
-          <w:lang w:val="es-419" w:eastAsia="es-CO"/>
-        </w:rPr>
-        <w:t>final</w:t>
+        <w:t>Enjuague final</w:t>
       </w:r>
       <w:r>
         <w:rPr>
@@ -9495,14 +9326,7 @@
         <w:rPr>
           <w:lang w:val="es-419" w:eastAsia="es-CO"/>
         </w:rPr>
-        <w:t>Retirar</w:t>
-      </w:r>
-      <w:proofErr w:type="gramEnd"/>
-      <w:r>
-        <w:rPr>
-          <w:lang w:val="es-419" w:eastAsia="es-CO"/>
-        </w:rPr>
-        <w:t xml:space="preserve"> el portafiltro, enjuagar y realizar 3 ciclos de </w:t>
+        <w:t xml:space="preserve">Retirar el portafiltro, enjuagar y realizar 3 ciclos de </w:t>
       </w:r>
       <w:r>
         <w:rPr>
@@ -14376,7 +14200,19 @@
               <w:rPr>
                 <w:lang w:val="es-CO"/>
               </w:rPr>
-              <w:t>Experto temático</w:t>
+              <w:t>Expert</w:t>
+            </w:r>
+            <w:r>
+              <w:rPr>
+                <w:lang w:val="es-CO"/>
+              </w:rPr>
+              <w:t>a</w:t>
+            </w:r>
+            <w:r>
+              <w:rPr>
+                <w:lang w:val="es-CO"/>
+              </w:rPr>
+              <w:t xml:space="preserve"> temático</w:t>
             </w:r>
           </w:p>
         </w:tc>
@@ -14728,7 +14564,19 @@
               <w:rPr>
                 <w:lang w:val="es-CO"/>
               </w:rPr>
-              <w:t>Evaluador de contenidos inclusivos y accesibles</w:t>
+              <w:t>Evaluador</w:t>
+            </w:r>
+            <w:r>
+              <w:rPr>
+                <w:lang w:val="es-CO"/>
+              </w:rPr>
+              <w:t>a</w:t>
+            </w:r>
+            <w:r>
+              <w:rPr>
+                <w:lang w:val="es-CO"/>
+              </w:rPr>
+              <w:t xml:space="preserve"> de contenidos inclusivos y accesibles</w:t>
             </w:r>
           </w:p>
         </w:tc>
@@ -14787,7 +14635,19 @@
               <w:rPr>
                 <w:lang w:val="es-CO"/>
               </w:rPr>
-              <w:t>Evaluador de contenidos inclusivos y accesibles</w:t>
+              <w:t>Evaluador</w:t>
+            </w:r>
+            <w:r>
+              <w:rPr>
+                <w:lang w:val="es-CO"/>
+              </w:rPr>
+              <w:t>a</w:t>
+            </w:r>
+            <w:r>
+              <w:rPr>
+                <w:lang w:val="es-CO"/>
+              </w:rPr>
+              <w:t xml:space="preserve"> de contenidos inclusivos y accesibles</w:t>
             </w:r>
           </w:p>
         </w:tc>
@@ -14849,7 +14709,31 @@
               <w:rPr>
                 <w:lang w:val="es-CO"/>
               </w:rPr>
-              <w:t>Validador y vinculador de recursos educativos digitales</w:t>
+              <w:t>Validador</w:t>
+            </w:r>
+            <w:r>
+              <w:rPr>
+                <w:lang w:val="es-CO"/>
+              </w:rPr>
+              <w:t>a</w:t>
+            </w:r>
+            <w:r>
+              <w:rPr>
+                <w:lang w:val="es-CO"/>
+              </w:rPr>
+              <w:t xml:space="preserve"> y vinculador</w:t>
+            </w:r>
+            <w:r>
+              <w:rPr>
+                <w:lang w:val="es-CO"/>
+              </w:rPr>
+              <w:t>a</w:t>
+            </w:r>
+            <w:r>
+              <w:rPr>
+                <w:lang w:val="es-CO"/>
+              </w:rPr>
+              <w:t xml:space="preserve"> de recursos educativos digitales</w:t>
             </w:r>
           </w:p>
         </w:tc>

</xml_diff>

<commit_message>
Ajustes de red 1.3
</commit_message>
<xml_diff>
--- a/fuentes/63560006_CFA01_DU.docx
+++ b/fuentes/63560006_CFA01_DU.docx
@@ -205,7 +205,7 @@
               </wp:anchor>
             </w:drawing>
           </mc:Choice>
-          <mc:Fallback xmlns:oel="http://schemas.microsoft.com/office/2019/extlst" xmlns:w16cei="http://schemas.microsoft.com/office/word/2026/wordml/cei" xmlns:w16du="http://schemas.microsoft.com/office/word/2023/wordml/word16du" xmlns:w16sdtfl="http://schemas.microsoft.com/office/word/2024/wordml/sdtformatlock">
+          <mc:Fallback xmlns:w16sdtfl="http://schemas.microsoft.com/office/word/2024/wordml/sdtformatlock" xmlns:w16du="http://schemas.microsoft.com/office/word/2023/wordml/word16du" xmlns:w16cei="http://schemas.microsoft.com/office/word/2026/wordml/cei" xmlns:oel="http://schemas.microsoft.com/office/2019/extlst">
             <w:pict>
               <v:rect w14:anchorId="4C256C62" id="Rectángulo 3" o:spid="_x0000_s1026" alt="&quot;&quot;" style="position:absolute;margin-left:-55.95pt;margin-top:26.4pt;width:613.85pt;height:164.25pt;z-index:-251655168;visibility:visible;mso-wrap-style:square;mso-height-percent:0;mso-wrap-distance-left:9pt;mso-wrap-distance-top:0;mso-wrap-distance-right:9pt;mso-wrap-distance-bottom:0;mso-position-horizontal:absolute;mso-position-horizontal-relative:text;mso-position-vertical:absolute;mso-position-vertical-relative:text;mso-height-percent:0;mso-height-relative:margin;v-text-anchor:middle" o:gfxdata="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" fillcolor="#00314d" stroked="f" strokeweight="1pt"/>
             </w:pict>
@@ -1479,7 +1479,15 @@
     </w:p>
     <w:p>
       <w:r>
-        <w:t>La preparación de una taza de café de calidad es el resultado de un proceso que inicia mucho antes de la extracción. Desde el cultivo y la cosecha hasta el beneficio y la tostión, cada etapa influye en las características sensoriales de la bebida. En Colombia, este proceso ha sido fortalecido por el trabajo de la Federación Nacional de Cafeteros y Cenicafé, instituciones que han impulsado el desarrollo técnico y científico del sector cafetero.</w:t>
+        <w:t xml:space="preserve">La preparación de una taza de café de calidad es el resultado de un proceso que inicia mucho antes de la extracción. Desde el cultivo y la cosecha hasta el beneficio y la </w:t>
+      </w:r>
+      <w:proofErr w:type="spellStart"/>
+      <w:r>
+        <w:t>tostión</w:t>
+      </w:r>
+      <w:proofErr w:type="spellEnd"/>
+      <w:r>
+        <w:t>, cada etapa influye en las características sensoriales de la bebida. En Colombia, este proceso ha sido fortalecido por el trabajo de la Federación Nacional de Cafeteros y Cenicafé, instituciones que han impulsado el desarrollo técnico y científico del sector cafetero.</w:t>
       </w:r>
     </w:p>
     <w:p>
@@ -1727,7 +1735,23 @@
           </w:p>
           <w:p>
             <w:r>
-              <w:t>La crema debe ser de color avellana con vetas atigradas y persistir al menos un minuto. Una crema muy clara indica subextracción; una muy oscura indica sobreextracción.</w:t>
+              <w:t xml:space="preserve">La crema debe ser de color avellana con vetas atigradas y persistir al menos un minuto. Una crema muy clara indica </w:t>
+            </w:r>
+            <w:proofErr w:type="spellStart"/>
+            <w:r>
+              <w:t>subextracción</w:t>
+            </w:r>
+            <w:proofErr w:type="spellEnd"/>
+            <w:r>
+              <w:t xml:space="preserve">; una muy oscura indica </w:t>
+            </w:r>
+            <w:proofErr w:type="spellStart"/>
+            <w:r>
+              <w:t>sobreextracción</w:t>
+            </w:r>
+            <w:proofErr w:type="spellEnd"/>
+            <w:r>
+              <w:t>.</w:t>
             </w:r>
           </w:p>
           <w:p>
@@ -2003,7 +2027,15 @@
     </w:p>
     <w:p>
       <w:r>
-        <w:t>Desde sus orígenes en las mesetas de Etiopía, donde la leyenda atribuye su descubrimiento al pastor Kaldi, el café se propagó hacia la península arábiga, donde los árabes comenzaron su cultivo y comercialización. A Europa llegó en el siglo XVII a través de los mercaderes venecianos, y de allí se extendió a las colonias americanas. Sin embargo, es en Colombia donde el café adquirió una dimensión social y económica única.</w:t>
+        <w:t xml:space="preserve">Desde sus orígenes en las mesetas de Etiopía, donde la leyenda atribuye su descubrimiento al pastor </w:t>
+      </w:r>
+      <w:proofErr w:type="spellStart"/>
+      <w:r>
+        <w:t>Kaldi</w:t>
+      </w:r>
+      <w:proofErr w:type="spellEnd"/>
+      <w:r>
+        <w:t>, el café se propagó hacia la península arábiga, donde los árabes comenzaron su cultivo y comercialización. A Europa llegó en el siglo XVII a través de los mercaderes venecianos, y de allí se extendió a las colonias americanas. Sin embargo, es en Colombia donde el café adquirió una dimensión social y económica única.</w:t>
       </w:r>
     </w:p>
     <w:p>
@@ -2710,6 +2742,7 @@
                 <w:rStyle w:val="Extranjerismo"/>
               </w:rPr>
             </w:pPr>
+            <w:proofErr w:type="spellStart"/>
             <w:r>
               <w:rPr>
                 <w:rStyle w:val="Extranjerismo"/>
@@ -2717,6 +2750,7 @@
               </w:rPr>
               <w:t>Honey</w:t>
             </w:r>
+            <w:proofErr w:type="spellEnd"/>
           </w:p>
         </w:tc>
         <w:tc>
@@ -2779,7 +2813,15 @@
     </w:p>
     <w:p>
       <w:r>
-        <w:t>El beneficio lavado, predominante en Colombia, merece una descripción más pormenorizada por su impacto directo en la calidad final del grano. La etapa de despulpado debe realizarse como máximo doce horas después de la cosecha para evitar fermentaciones no deseadas que generarían defectos en taza. Durante la fermentación, que puede durar según la temperatura ambiente entre catorce y veinticuatro horas, las levaduras y bacterias presentes de forma natural descomponen los azúcares del mucílago, produciendo compuestos precursores del aroma y facilitando que el lavado posterior elimine completamente la capa gelatinosa. Un retraso en la fermentación más allá del punto óptimo ocasiona los defectos conocidos como “vinagre” o “fermento”, sabores que arruinan la taza y se consideran faltas graves en la cata. Por eso Cenicafé desarrolló el “fermaestro”, un sencillo dispositivo que indica con precisión el momento de finalización de la fermentación.</w:t>
+        <w:t>El beneficio lavado, predominante en Colombia, merece una descripción más pormenorizada por su impacto directo en la calidad final del grano. La etapa de despulpado debe realizarse como máximo doce horas después de la cosecha para evitar fermentaciones no deseadas que generarían defectos en taza. Durante la fermentación, que puede durar según la temperatura ambiente entre catorce y veinticuatro horas, las levaduras y bacterias presentes de forma natural descomponen los azúcares del mucílago, produciendo compuestos precursores del aroma y facilitando que el lavado posterior elimine completamente la capa gelatinosa. Un retraso en la fermentación más allá del punto óptimo ocasiona los defectos conocidos como “vinagre” o “fermento”, sabores que arruinan la taza y se consideran faltas graves en la cata. Por eso Cenicafé desarrolló el “</w:t>
+      </w:r>
+      <w:proofErr w:type="spellStart"/>
+      <w:r>
+        <w:t>fermaestro</w:t>
+      </w:r>
+      <w:proofErr w:type="spellEnd"/>
+      <w:r>
+        <w:t>”, un sencillo dispositivo que indica con precisión el momento de finalización de la fermentación.</w:t>
       </w:r>
     </w:p>
     <w:p>
@@ -2823,7 +2865,15 @@
         <w:t>Beneficio natural</w:t>
       </w:r>
       <w:r>
-        <w:t>: más común en Brasil y Etiopía. Ahorra agua, pero requiere clima seco y supervisión constante. Exalta la frutosidad del grano.</w:t>
+        <w:t xml:space="preserve">: más común en Brasil y Etiopía. Ahorra agua, pero requiere clima seco y supervisión constante. Exalta la </w:t>
+      </w:r>
+      <w:proofErr w:type="spellStart"/>
+      <w:r>
+        <w:t>frutosidad</w:t>
+      </w:r>
+      <w:proofErr w:type="spellEnd"/>
+      <w:r>
+        <w:t xml:space="preserve"> del grano.</w:t>
       </w:r>
     </w:p>
     <w:p>
@@ -2866,21 +2916,25 @@
       <w:r>
         <w:t xml:space="preserve">Aunque existen más de 100 especies de </w:t>
       </w:r>
+      <w:proofErr w:type="spellStart"/>
       <w:r>
         <w:rPr>
           <w:rStyle w:val="Extranjerismo"/>
         </w:rPr>
         <w:t>coffea</w:t>
       </w:r>
+      <w:proofErr w:type="spellEnd"/>
       <w:r>
         <w:t xml:space="preserve">, Colombia ha centrado históricamente su producción en una sola: </w:t>
       </w:r>
+      <w:proofErr w:type="spellStart"/>
       <w:r>
         <w:rPr>
           <w:rStyle w:val="Extranjerismo"/>
         </w:rPr>
         <w:t>coffea</w:t>
       </w:r>
+      <w:proofErr w:type="spellEnd"/>
       <w:r>
         <w:t xml:space="preserve"> arábica, reconocida por su superior </w:t>
       </w:r>
@@ -2897,12 +2951,14 @@
       <w:r>
         <w:t xml:space="preserve"> </w:t>
       </w:r>
+      <w:proofErr w:type="spellStart"/>
       <w:r>
         <w:rPr>
           <w:rStyle w:val="Extranjerismo"/>
         </w:rPr>
         <w:t>canephora</w:t>
       </w:r>
+      <w:proofErr w:type="spellEnd"/>
       <w:r>
         <w:t xml:space="preserve"> (robusta), que contiene hasta el doble de cafeína y presenta notas terrosas y amargas, la arábica se caracteriza por su aroma complejo, su acidez equilibrada y su cuerpo suave. Su demanda en el mercado es significativamente mayor.</w:t>
       </w:r>
@@ -2911,12 +2967,28 @@
       <w:r>
         <w:t>Dentro de la especie arábica, el trabajo de mejoramiento genético de Cenicafé ha sido fundamental para dotar a los cafetales colombianos de variedades altamente productivas y resistentes a la roya del cafeto (</w:t>
       </w:r>
+      <w:proofErr w:type="spellStart"/>
       <w:r>
         <w:rPr>
           <w:rStyle w:val="Extranjerismo"/>
         </w:rPr>
-        <w:t>hemileia vastatrix</w:t>
-      </w:r>
+        <w:t>hemileia</w:t>
+      </w:r>
+      <w:proofErr w:type="spellEnd"/>
+      <w:r>
+        <w:rPr>
+          <w:rStyle w:val="Extranjerismo"/>
+        </w:rPr>
+        <w:t xml:space="preserve"> </w:t>
+      </w:r>
+      <w:proofErr w:type="spellStart"/>
+      <w:r>
+        <w:rPr>
+          <w:rStyle w:val="Extranjerismo"/>
+        </w:rPr>
+        <w:t>vastatrix</w:t>
+      </w:r>
+      <w:proofErr w:type="spellEnd"/>
       <w:r>
         <w:t>). Las principales variedades en Colombia son:</w:t>
       </w:r>
@@ -3029,12 +3101,14 @@
       <w:r>
         <w:t xml:space="preserve"> </w:t>
       </w:r>
+      <w:proofErr w:type="spellStart"/>
       <w:r>
         <w:rPr>
           <w:rStyle w:val="Extranjerismo"/>
         </w:rPr>
         <w:t>canephora</w:t>
       </w:r>
+      <w:proofErr w:type="spellEnd"/>
       <w:r>
         <w:t xml:space="preserve"> (Robusta)</w:t>
       </w:r>
@@ -3120,7 +3194,15 @@
               <w:pStyle w:val="TextoTablas"/>
             </w:pPr>
             <w:r>
-              <w:t>1.000 – 2.000 m s.n.m.</w:t>
+              <w:t xml:space="preserve">1.000 – 2.000 m </w:t>
+            </w:r>
+            <w:proofErr w:type="spellStart"/>
+            <w:r>
+              <w:t>s.n.m</w:t>
+            </w:r>
+            <w:proofErr w:type="spellEnd"/>
+            <w:r>
+              <w:t>.</w:t>
             </w:r>
           </w:p>
         </w:tc>
@@ -3133,7 +3215,15 @@
               <w:pStyle w:val="TextoTablas"/>
             </w:pPr>
             <w:r>
-              <w:t>0 – 800 m s.n.m.</w:t>
+              <w:t xml:space="preserve">0 – 800 m </w:t>
+            </w:r>
+            <w:proofErr w:type="spellStart"/>
+            <w:r>
+              <w:t>s.n.m</w:t>
+            </w:r>
+            <w:proofErr w:type="spellEnd"/>
+            <w:r>
+              <w:t>.</w:t>
             </w:r>
           </w:p>
         </w:tc>
@@ -3365,28 +3455,68 @@
       <w:r>
         <w:t>astillo. En 2016 se lanzó la variedad Cenicafé 1, de porte alto y muy buena calidad potencial, que se ha sembrado especialmente en zonas tradicionales donde la roya es un problema recurrente y se requiere un manejo agronómico intensivo. Además de la resistencia a la roya (</w:t>
       </w:r>
+      <w:proofErr w:type="spellStart"/>
       <w:r>
         <w:rPr>
           <w:rStyle w:val="Extranjerismo"/>
         </w:rPr>
-        <w:t>hemileia vastatrix</w:t>
-      </w:r>
+        <w:t>hemileia</w:t>
+      </w:r>
+      <w:proofErr w:type="spellEnd"/>
+      <w:r>
+        <w:rPr>
+          <w:rStyle w:val="Extranjerismo"/>
+        </w:rPr>
+        <w:t xml:space="preserve"> </w:t>
+      </w:r>
+      <w:proofErr w:type="spellStart"/>
+      <w:r>
+        <w:rPr>
+          <w:rStyle w:val="Extranjerismo"/>
+        </w:rPr>
+        <w:t>vastatrix</w:t>
+      </w:r>
+      <w:proofErr w:type="spellEnd"/>
       <w:r>
         <w:t>), estas variedades presentan tolerancia a otras enfermedades como la mancha de hierro (</w:t>
       </w:r>
+      <w:proofErr w:type="spellStart"/>
       <w:r>
         <w:rPr>
           <w:rStyle w:val="Extranjerismo"/>
         </w:rPr>
-        <w:t>cercospora coffeicola</w:t>
-      </w:r>
+        <w:t>cercospora</w:t>
+      </w:r>
+      <w:proofErr w:type="spellEnd"/>
+      <w:r>
+        <w:rPr>
+          <w:rStyle w:val="Extranjerismo"/>
+        </w:rPr>
+        <w:t xml:space="preserve"> </w:t>
+      </w:r>
+      <w:proofErr w:type="spellStart"/>
+      <w:r>
+        <w:rPr>
+          <w:rStyle w:val="Extranjerismo"/>
+        </w:rPr>
+        <w:t>coffeicola</w:t>
+      </w:r>
+      <w:proofErr w:type="spellEnd"/>
       <w:r>
         <w:t xml:space="preserve">) y una arquitectura que facilita el control biológico de la broca. </w:t>
       </w:r>
     </w:p>
     <w:p>
       <w:r>
-        <w:t xml:space="preserve">Es fundamental que el barista entienda la relación entre la variedad y la preparación: un café Castillo cultivado a 1.800 metros de altitud en el Huila puede exhibir notas de caramelo, frutos rojos y acidez media-alta, ideal para métodos filtrados (V60 o Chemex), mientras que un Caturra de 1.200 metros en Santander tendrá cuerpo más ligero, acidez baja y notas de chocolate, que se presta muy bien para mezclas de </w:t>
+        <w:t xml:space="preserve">Es fundamental que el barista entienda la relación entre la variedad y la preparación: un café Castillo cultivado a 1.800 metros de altitud en el Huila puede exhibir notas de caramelo, frutos rojos y acidez media-alta, ideal para métodos filtrados (V60 o </w:t>
+      </w:r>
+      <w:proofErr w:type="spellStart"/>
+      <w:r>
+        <w:t>Chemex</w:t>
+      </w:r>
+      <w:proofErr w:type="spellEnd"/>
+      <w:r>
+        <w:t xml:space="preserve">), mientras que un Caturra de 1.200 metros en Santander tendrá cuerpo más ligero, acidez baja y notas de chocolate, que se presta muy bien para mezclas de </w:t>
       </w:r>
       <w:r>
         <w:rPr>
@@ -3777,7 +3907,15 @@
               <w:pStyle w:val="TextoTablas"/>
             </w:pPr>
             <w:r>
-              <w:t>Dureza total (como CaCO₃)</w:t>
+              <w:t xml:space="preserve">Dureza total (como </w:t>
+            </w:r>
+            <w:proofErr w:type="spellStart"/>
+            <w:r>
+              <w:t>CaCO</w:t>
+            </w:r>
+            <w:proofErr w:type="spellEnd"/>
+            <w:r>
+              <w:t>₃)</w:t>
             </w:r>
           </w:p>
         </w:tc>
@@ -3888,7 +4026,15 @@
               <w:pStyle w:val="TextoTablas"/>
             </w:pPr>
             <w:r>
-              <w:t>Sodio (Na⁺)</w:t>
+              <w:t>Sodio (</w:t>
+            </w:r>
+            <w:proofErr w:type="spellStart"/>
+            <w:r>
+              <w:t>Na</w:t>
+            </w:r>
+            <w:proofErr w:type="spellEnd"/>
+            <w:r>
+              <w:t>⁺)</w:t>
             </w:r>
           </w:p>
         </w:tc>
@@ -4105,7 +4251,21 @@
         <w:rPr>
           <w:lang w:val="es-419" w:eastAsia="es-CO"/>
         </w:rPr>
-        <w:t>: añadidos para desinfección, generan sabores a "medicina" y pueden reaccionar con compuestos del café produciendo clorofenoles.</w:t>
+        <w:t xml:space="preserve">: añadidos para desinfección, generan sabores a "medicina" y pueden reaccionar con compuestos del café produciendo </w:t>
+      </w:r>
+      <w:proofErr w:type="spellStart"/>
+      <w:r>
+        <w:rPr>
+          <w:lang w:val="es-419" w:eastAsia="es-CO"/>
+        </w:rPr>
+        <w:t>clorofenoles</w:t>
+      </w:r>
+      <w:proofErr w:type="spellEnd"/>
+      <w:r>
+        <w:rPr>
+          <w:lang w:val="es-419" w:eastAsia="es-CO"/>
+        </w:rPr>
+        <w:t>.</w:t>
       </w:r>
     </w:p>
     <w:p>
@@ -4491,7 +4651,15 @@
               <w:pStyle w:val="TextoTablas"/>
             </w:pPr>
             <w:r>
-              <w:t>Requiere remineralización; alto</w:t>
+              <w:t xml:space="preserve">Requiere </w:t>
+            </w:r>
+            <w:proofErr w:type="spellStart"/>
+            <w:r>
+              <w:t>remineralización</w:t>
+            </w:r>
+            <w:proofErr w:type="spellEnd"/>
+            <w:r>
+              <w:t>; alto</w:t>
             </w:r>
           </w:p>
         </w:tc>
@@ -4508,8 +4676,13 @@
             <w:pPr>
               <w:pStyle w:val="TextoTablas"/>
             </w:pPr>
-            <w:r>
-              <w:t>Remineralización (post-OI)</w:t>
+            <w:proofErr w:type="spellStart"/>
+            <w:r>
+              <w:t>Remineralización</w:t>
+            </w:r>
+            <w:proofErr w:type="spellEnd"/>
+            <w:r>
+              <w:t> (post-OI)</w:t>
             </w:r>
           </w:p>
         </w:tc>
@@ -4968,8 +5141,23 @@
         <w:rPr>
           <w:lang w:val="es-419" w:eastAsia="es-CO"/>
         </w:rPr>
-        <w:t xml:space="preserve">: realizar limpieza diaria (portafiltro, lanza). </w:t>
-      </w:r>
+        <w:t>: realizar limpieza diaria (</w:t>
+      </w:r>
+      <w:proofErr w:type="spellStart"/>
+      <w:r>
+        <w:rPr>
+          <w:lang w:val="es-419" w:eastAsia="es-CO"/>
+        </w:rPr>
+        <w:t>portafiltro</w:t>
+      </w:r>
+      <w:proofErr w:type="spellEnd"/>
+      <w:r>
+        <w:rPr>
+          <w:lang w:val="es-419" w:eastAsia="es-CO"/>
+        </w:rPr>
+        <w:t xml:space="preserve">, lanza). </w:t>
+      </w:r>
+      <w:proofErr w:type="spellStart"/>
       <w:r>
         <w:rPr>
           <w:rStyle w:val="Extranjerismo"/>
@@ -4977,6 +5165,7 @@
         </w:rPr>
         <w:t>Backflush</w:t>
       </w:r>
+      <w:proofErr w:type="spellEnd"/>
       <w:r>
         <w:rPr>
           <w:lang w:val="es-419" w:eastAsia="es-CO"/>
@@ -5173,16 +5362,42 @@
             <w:pPr>
               <w:pStyle w:val="TextoTablas"/>
             </w:pPr>
+            <w:proofErr w:type="spellStart"/>
             <w:r>
               <w:rPr>
                 <w:rStyle w:val="Extranjerismo"/>
                 <w:lang w:val="es-419"/>
               </w:rPr>
               <w:lastRenderedPageBreak/>
-              <w:t>Pour over</w:t>
-            </w:r>
-            <w:r>
-              <w:t xml:space="preserve"> (V60/Chemex)</w:t>
+              <w:t>Pour</w:t>
+            </w:r>
+            <w:proofErr w:type="spellEnd"/>
+            <w:r>
+              <w:rPr>
+                <w:rStyle w:val="Extranjerismo"/>
+                <w:lang w:val="es-419"/>
+              </w:rPr>
+              <w:t xml:space="preserve"> </w:t>
+            </w:r>
+            <w:proofErr w:type="spellStart"/>
+            <w:r>
+              <w:rPr>
+                <w:rStyle w:val="Extranjerismo"/>
+                <w:lang w:val="es-419"/>
+              </w:rPr>
+              <w:t>over</w:t>
+            </w:r>
+            <w:proofErr w:type="spellEnd"/>
+            <w:r>
+              <w:t xml:space="preserve"> (V60/</w:t>
+            </w:r>
+            <w:proofErr w:type="spellStart"/>
+            <w:r>
+              <w:t>Chemex</w:t>
+            </w:r>
+            <w:proofErr w:type="spellEnd"/>
+            <w:r>
+              <w:t>)</w:t>
             </w:r>
           </w:p>
         </w:tc>
@@ -5266,9 +5481,11 @@
             <w:pPr>
               <w:pStyle w:val="TextoTablas"/>
             </w:pPr>
+            <w:proofErr w:type="spellStart"/>
             <w:r>
               <w:t>Aeropress</w:t>
             </w:r>
+            <w:proofErr w:type="spellEnd"/>
           </w:p>
         </w:tc>
         <w:tc>
@@ -5425,7 +5642,21 @@
         <w:rPr>
           <w:lang w:val="es-419" w:eastAsia="es-CO"/>
         </w:rPr>
-        <w:t>Sin embargo, no todos los compuestos se disuelven a la misma velocidad. Los ácidos y la cafeína son muy solubles y se liberan rápidamente; los azúcares y las melanoidinas lo hacen más lentamente. Si la molienda es muy gruesa, el agua pasa rápidamente y extrae solo los compuestos más solubles, resultando en una taza ácida y aguada (subextracción). Si la molienda es muy fina, el agua permanece demasiado tiempo en contacto con el café, extrayendo compuestos amargos y astringentes (sobre extracción).</w:t>
+        <w:t>Sin embargo, no todos los compuestos se disuelven a la misma velocidad. Los ácidos y la cafeína son muy solubles y se liberan rápidamente; los azúcares y las melanoidinas lo hacen más lentamente. Si la molienda es muy gruesa, el agua pasa rápidamente y extrae solo los compuestos más solubles, resultando en una taza ácida y aguada (</w:t>
+      </w:r>
+      <w:proofErr w:type="spellStart"/>
+      <w:r>
+        <w:rPr>
+          <w:lang w:val="es-419" w:eastAsia="es-CO"/>
+        </w:rPr>
+        <w:t>subextracción</w:t>
+      </w:r>
+      <w:proofErr w:type="spellEnd"/>
+      <w:r>
+        <w:rPr>
+          <w:lang w:val="es-419" w:eastAsia="es-CO"/>
+        </w:rPr>
+        <w:t>). Si la molienda es muy fina, el agua permanece demasiado tiempo en contacto con el café, extrayendo compuestos amargos y astringentes (sobre extracción).</w:t>
       </w:r>
     </w:p>
     <w:p>
@@ -5518,7 +5749,15 @@
               <w:pStyle w:val="TextoTablas"/>
             </w:pPr>
             <w:r>
-              <w:t>Rango (μm)</w:t>
+              <w:t>Rango (</w:t>
+            </w:r>
+            <w:proofErr w:type="spellStart"/>
+            <w:r>
+              <w:t>μm</w:t>
+            </w:r>
+            <w:proofErr w:type="spellEnd"/>
+            <w:r>
+              <w:t>)</w:t>
             </w:r>
           </w:p>
         </w:tc>
@@ -5823,6 +6062,7 @@
         </w:rPr>
         <w:t xml:space="preserve">Medición en cafetería: se puede usar un analizador manual de tamices como el </w:t>
       </w:r>
+      <w:proofErr w:type="spellStart"/>
       <w:r>
         <w:rPr>
           <w:rStyle w:val="Extranjerismo"/>
@@ -5830,6 +6070,7 @@
         </w:rPr>
         <w:t>Kruve</w:t>
       </w:r>
+      <w:proofErr w:type="spellEnd"/>
       <w:r>
         <w:rPr>
           <w:lang w:val="es-419" w:eastAsia="es-CO"/>
@@ -6281,7 +6522,21 @@
         <w:rPr>
           <w:lang w:val="es-419" w:eastAsia="es-CO"/>
         </w:rPr>
-        <w:t xml:space="preserve">: uso doméstico o en cafeterías de muy bajo volumen (menos de 2 kg/día) para métodos de filtro (V60, Chemex, prensa francesa). No son </w:t>
+        <w:t xml:space="preserve">: uso doméstico o en cafeterías de muy bajo volumen (menos de 2 kg/día) para métodos de filtro (V60, </w:t>
+      </w:r>
+      <w:proofErr w:type="spellStart"/>
+      <w:r>
+        <w:rPr>
+          <w:lang w:val="es-419" w:eastAsia="es-CO"/>
+        </w:rPr>
+        <w:t>Chemex</w:t>
+      </w:r>
+      <w:proofErr w:type="spellEnd"/>
+      <w:r>
+        <w:rPr>
+          <w:lang w:val="es-419" w:eastAsia="es-CO"/>
+        </w:rPr>
+        <w:t xml:space="preserve">, prensa francesa). No son </w:t>
       </w:r>
       <w:r>
         <w:rPr>
@@ -6320,7 +6575,35 @@
         <w:rPr>
           <w:lang w:val="es-419" w:eastAsia="es-CO"/>
         </w:rPr>
-        <w:t xml:space="preserve">Ejemplo Molino Eureka Mignon Manuale véase. </w:t>
+        <w:t xml:space="preserve">Ejemplo Molino Eureka </w:t>
+      </w:r>
+      <w:proofErr w:type="spellStart"/>
+      <w:r>
+        <w:rPr>
+          <w:lang w:val="es-419" w:eastAsia="es-CO"/>
+        </w:rPr>
+        <w:t>Mignon</w:t>
+      </w:r>
+      <w:proofErr w:type="spellEnd"/>
+      <w:r>
+        <w:rPr>
+          <w:lang w:val="es-419" w:eastAsia="es-CO"/>
+        </w:rPr>
+        <w:t xml:space="preserve"> </w:t>
+      </w:r>
+      <w:proofErr w:type="spellStart"/>
+      <w:r>
+        <w:rPr>
+          <w:lang w:val="es-419" w:eastAsia="es-CO"/>
+        </w:rPr>
+        <w:t>Manuale</w:t>
+      </w:r>
+      <w:proofErr w:type="spellEnd"/>
+      <w:r>
+        <w:rPr>
+          <w:lang w:val="es-419" w:eastAsia="es-CO"/>
+        </w:rPr>
+        <w:t xml:space="preserve"> véase. </w:t>
       </w:r>
       <w:hyperlink r:id="rId15" w:history="1">
         <w:r>
@@ -6328,7 +6611,39 @@
             <w:rStyle w:val="Hipervnculo"/>
             <w:szCs w:val="28"/>
           </w:rPr>
-          <w:t>Molino Eureka Mignon Manuale Color Negro - Homecenter.com.co</w:t>
+          <w:t xml:space="preserve">Molino Eureka </w:t>
+        </w:r>
+        <w:proofErr w:type="spellStart"/>
+        <w:r>
+          <w:rPr>
+            <w:rStyle w:val="Hipervnculo"/>
+            <w:szCs w:val="28"/>
+          </w:rPr>
+          <w:t>Mignon</w:t>
+        </w:r>
+        <w:proofErr w:type="spellEnd"/>
+        <w:r>
+          <w:rPr>
+            <w:rStyle w:val="Hipervnculo"/>
+            <w:szCs w:val="28"/>
+          </w:rPr>
+          <w:t xml:space="preserve"> </w:t>
+        </w:r>
+        <w:proofErr w:type="spellStart"/>
+        <w:r>
+          <w:rPr>
+            <w:rStyle w:val="Hipervnculo"/>
+            <w:szCs w:val="28"/>
+          </w:rPr>
+          <w:t>Manuale</w:t>
+        </w:r>
+        <w:proofErr w:type="spellEnd"/>
+        <w:r>
+          <w:rPr>
+            <w:rStyle w:val="Hipervnculo"/>
+            <w:szCs w:val="28"/>
+          </w:rPr>
+          <w:t xml:space="preserve"> Color Negro - Homecenter.com.co</w:t>
         </w:r>
       </w:hyperlink>
     </w:p>
@@ -6469,13 +6784,31 @@
         </w:rPr>
         <w:t xml:space="preserve">turco hasta más de 1.200 micras para </w:t>
       </w:r>
+      <w:proofErr w:type="spellStart"/>
       <w:r>
         <w:rPr>
           <w:rStyle w:val="Extranjerismo"/>
           <w:lang w:val="es-419" w:eastAsia="es-CO"/>
         </w:rPr>
-        <w:t>cold brew</w:t>
-      </w:r>
+        <w:t>cold</w:t>
+      </w:r>
+      <w:proofErr w:type="spellEnd"/>
+      <w:r>
+        <w:rPr>
+          <w:rStyle w:val="Extranjerismo"/>
+          <w:lang w:val="es-419" w:eastAsia="es-CO"/>
+        </w:rPr>
+        <w:t xml:space="preserve"> </w:t>
+      </w:r>
+      <w:proofErr w:type="spellStart"/>
+      <w:r>
+        <w:rPr>
+          <w:rStyle w:val="Extranjerismo"/>
+          <w:lang w:val="es-419" w:eastAsia="es-CO"/>
+        </w:rPr>
+        <w:t>brew</w:t>
+      </w:r>
+      <w:proofErr w:type="spellEnd"/>
       <w:r>
         <w:rPr>
           <w:lang w:val="es-419" w:eastAsia="es-CO"/>
@@ -6598,12 +6931,14 @@
         </w:rPr>
         <w:t xml:space="preserve">y </w:t>
       </w:r>
+      <w:proofErr w:type="spellStart"/>
       <w:r>
         <w:rPr>
           <w:rStyle w:val="Extranjerismo"/>
         </w:rPr>
         <w:t>aeropress</w:t>
       </w:r>
+      <w:proofErr w:type="spellEnd"/>
       <w:r>
         <w:rPr>
           <w:lang w:val="es-419" w:eastAsia="es-CO"/>
@@ -6622,7 +6957,35 @@
         <w:rPr>
           <w:lang w:val="es-419" w:eastAsia="es-CO"/>
         </w:rPr>
-        <w:t xml:space="preserve">Ejemplos Mazzer Kold S, a continuación:  </w:t>
+        <w:t xml:space="preserve">Ejemplos </w:t>
+      </w:r>
+      <w:proofErr w:type="spellStart"/>
+      <w:r>
+        <w:rPr>
+          <w:lang w:val="es-419" w:eastAsia="es-CO"/>
+        </w:rPr>
+        <w:t>Mazzer</w:t>
+      </w:r>
+      <w:proofErr w:type="spellEnd"/>
+      <w:r>
+        <w:rPr>
+          <w:lang w:val="es-419" w:eastAsia="es-CO"/>
+        </w:rPr>
+        <w:t xml:space="preserve"> </w:t>
+      </w:r>
+      <w:proofErr w:type="spellStart"/>
+      <w:r>
+        <w:rPr>
+          <w:lang w:val="es-419" w:eastAsia="es-CO"/>
+        </w:rPr>
+        <w:t>Kold</w:t>
+      </w:r>
+      <w:proofErr w:type="spellEnd"/>
+      <w:r>
+        <w:rPr>
+          <w:lang w:val="es-419" w:eastAsia="es-CO"/>
+        </w:rPr>
+        <w:t xml:space="preserve"> S, a continuación:  </w:t>
       </w:r>
       <w:hyperlink r:id="rId16" w:history="1">
         <w:r>
@@ -6630,7 +6993,55 @@
             <w:rStyle w:val="Hipervnculo"/>
             <w:szCs w:val="28"/>
           </w:rPr>
-          <w:t>Molino Mazzer Kold S – Almanegra Café</w:t>
+          <w:t xml:space="preserve">Molino </w:t>
+        </w:r>
+        <w:proofErr w:type="spellStart"/>
+        <w:r>
+          <w:rPr>
+            <w:rStyle w:val="Hipervnculo"/>
+            <w:szCs w:val="28"/>
+          </w:rPr>
+          <w:t>Mazzer</w:t>
+        </w:r>
+        <w:proofErr w:type="spellEnd"/>
+        <w:r>
+          <w:rPr>
+            <w:rStyle w:val="Hipervnculo"/>
+            <w:szCs w:val="28"/>
+          </w:rPr>
+          <w:t xml:space="preserve"> </w:t>
+        </w:r>
+        <w:proofErr w:type="spellStart"/>
+        <w:r>
+          <w:rPr>
+            <w:rStyle w:val="Hipervnculo"/>
+            <w:szCs w:val="28"/>
+          </w:rPr>
+          <w:t>Kold</w:t>
+        </w:r>
+        <w:proofErr w:type="spellEnd"/>
+        <w:r>
+          <w:rPr>
+            <w:rStyle w:val="Hipervnculo"/>
+            <w:szCs w:val="28"/>
+          </w:rPr>
+          <w:t xml:space="preserve"> S – </w:t>
+        </w:r>
+        <w:proofErr w:type="spellStart"/>
+        <w:r>
+          <w:rPr>
+            <w:rStyle w:val="Hipervnculo"/>
+            <w:szCs w:val="28"/>
+          </w:rPr>
+          <w:t>Almanegra</w:t>
+        </w:r>
+        <w:proofErr w:type="spellEnd"/>
+        <w:r>
+          <w:rPr>
+            <w:rStyle w:val="Hipervnculo"/>
+            <w:szCs w:val="28"/>
+          </w:rPr>
+          <w:t xml:space="preserve"> Café</w:t>
         </w:r>
       </w:hyperlink>
     </w:p>
@@ -7366,7 +7777,15 @@
               <w:pStyle w:val="TextoTablas"/>
             </w:pPr>
             <w:r>
-              <w:t>Fina (200-400 μm).</w:t>
+              <w:t xml:space="preserve">Fina (200-400 </w:t>
+            </w:r>
+            <w:proofErr w:type="spellStart"/>
+            <w:r>
+              <w:t>μm</w:t>
+            </w:r>
+            <w:proofErr w:type="spellEnd"/>
+            <w:r>
+              <w:t>).</w:t>
             </w:r>
           </w:p>
         </w:tc>
@@ -7426,7 +7845,15 @@
               <w:pStyle w:val="TextoTablas"/>
             </w:pPr>
             <w:r>
-              <w:t>Media-fina (400-700 μm).</w:t>
+              <w:t xml:space="preserve">Media-fina (400-700 </w:t>
+            </w:r>
+            <w:proofErr w:type="spellStart"/>
+            <w:r>
+              <w:t>μm</w:t>
+            </w:r>
+            <w:proofErr w:type="spellEnd"/>
+            <w:r>
+              <w:t>).</w:t>
             </w:r>
           </w:p>
         </w:tc>
@@ -7483,7 +7910,15 @@
               <w:pStyle w:val="TextoTablas"/>
             </w:pPr>
             <w:r>
-              <w:t>Gruesa (900-1200 μm).</w:t>
+              <w:t xml:space="preserve">Gruesa (900-1200 </w:t>
+            </w:r>
+            <w:proofErr w:type="spellStart"/>
+            <w:r>
+              <w:t>μm</w:t>
+            </w:r>
+            <w:proofErr w:type="spellEnd"/>
+            <w:r>
+              <w:t>).</w:t>
             </w:r>
           </w:p>
         </w:tc>
@@ -7541,6 +7976,7 @@
         <w:lastRenderedPageBreak/>
         <w:t xml:space="preserve">Explore el siguiente video y fortalezca sus conocimientos sobre la calibración del molino y los parámetros del </w:t>
       </w:r>
+      <w:proofErr w:type="spellStart"/>
       <w:r>
         <w:rPr>
           <w:rStyle w:val="Extranjerismo"/>
@@ -7548,6 +7984,7 @@
         </w:rPr>
         <w:t>espresso</w:t>
       </w:r>
+      <w:proofErr w:type="spellEnd"/>
       <w:r>
         <w:rPr>
           <w:lang w:val="es-419" w:eastAsia="es-CO"/>
@@ -7989,8 +8426,16 @@
         <w:rPr>
           <w:lang w:val="es-419" w:eastAsia="es-CO"/>
         </w:rPr>
-        <w:t>Grupo portafiltro</w:t>
-      </w:r>
+        <w:t xml:space="preserve">Grupo </w:t>
+      </w:r>
+      <w:proofErr w:type="spellStart"/>
+      <w:r>
+        <w:rPr>
+          <w:lang w:val="es-419" w:eastAsia="es-CO"/>
+        </w:rPr>
+        <w:t>portafiltro</w:t>
+      </w:r>
+      <w:proofErr w:type="spellEnd"/>
       <w:r>
         <w:rPr>
           <w:lang w:val="es-419" w:eastAsia="es-CO"/>
@@ -8189,6 +8634,7 @@
         </w:rPr>
         <w:t>Molinos a demanda (</w:t>
       </w:r>
+      <w:proofErr w:type="spellStart"/>
       <w:r>
         <w:rPr>
           <w:rStyle w:val="Extranjerismo"/>
@@ -8196,8 +8642,49 @@
           <w:bCs/>
           <w:lang w:val="es-419" w:eastAsia="es-CO"/>
         </w:rPr>
-        <w:t>on demand / grind-by-weight</w:t>
-      </w:r>
+        <w:t>on</w:t>
+      </w:r>
+      <w:proofErr w:type="spellEnd"/>
+      <w:r>
+        <w:rPr>
+          <w:rStyle w:val="Extranjerismo"/>
+          <w:b/>
+          <w:bCs/>
+          <w:lang w:val="es-419" w:eastAsia="es-CO"/>
+        </w:rPr>
+        <w:t xml:space="preserve"> </w:t>
+      </w:r>
+      <w:proofErr w:type="spellStart"/>
+      <w:r>
+        <w:rPr>
+          <w:rStyle w:val="Extranjerismo"/>
+          <w:b/>
+          <w:bCs/>
+          <w:lang w:val="es-419" w:eastAsia="es-CO"/>
+        </w:rPr>
+        <w:t>demand</w:t>
+      </w:r>
+      <w:proofErr w:type="spellEnd"/>
+      <w:r>
+        <w:rPr>
+          <w:rStyle w:val="Extranjerismo"/>
+          <w:b/>
+          <w:bCs/>
+          <w:lang w:val="es-419" w:eastAsia="es-CO"/>
+        </w:rPr>
+        <w:t xml:space="preserve"> / </w:t>
+      </w:r>
+      <w:proofErr w:type="spellStart"/>
+      <w:r>
+        <w:rPr>
+          <w:rStyle w:val="Extranjerismo"/>
+          <w:b/>
+          <w:bCs/>
+          <w:lang w:val="es-419" w:eastAsia="es-CO"/>
+        </w:rPr>
+        <w:t>grind-by-weight</w:t>
+      </w:r>
+      <w:proofErr w:type="spellEnd"/>
       <w:r>
         <w:rPr>
           <w:b/>
@@ -8285,6 +8772,7 @@
           <w:lang w:val="es-419" w:eastAsia="es-CO"/>
         </w:rPr>
       </w:pPr>
+      <w:proofErr w:type="spellStart"/>
       <w:r>
         <w:rPr>
           <w:rStyle w:val="Extranjerismo"/>
@@ -8292,15 +8780,72 @@
           <w:bCs/>
           <w:lang w:val="es-419" w:eastAsia="es-CO"/>
         </w:rPr>
-        <w:t>Pour over</w:t>
-      </w:r>
-      <w:r>
-        <w:rPr>
-          <w:b/>
-          <w:bCs/>
-          <w:lang w:val="es-419" w:eastAsia="es-CO"/>
-        </w:rPr>
-        <w:t xml:space="preserve"> (V60, Chemex, Kalita Wave)</w:t>
+        <w:t>Pour</w:t>
+      </w:r>
+      <w:proofErr w:type="spellEnd"/>
+      <w:r>
+        <w:rPr>
+          <w:rStyle w:val="Extranjerismo"/>
+          <w:b/>
+          <w:bCs/>
+          <w:lang w:val="es-419" w:eastAsia="es-CO"/>
+        </w:rPr>
+        <w:t xml:space="preserve"> </w:t>
+      </w:r>
+      <w:proofErr w:type="spellStart"/>
+      <w:r>
+        <w:rPr>
+          <w:rStyle w:val="Extranjerismo"/>
+          <w:b/>
+          <w:bCs/>
+          <w:lang w:val="es-419" w:eastAsia="es-CO"/>
+        </w:rPr>
+        <w:t>over</w:t>
+      </w:r>
+      <w:proofErr w:type="spellEnd"/>
+      <w:r>
+        <w:rPr>
+          <w:b/>
+          <w:bCs/>
+          <w:lang w:val="es-419" w:eastAsia="es-CO"/>
+        </w:rPr>
+        <w:t xml:space="preserve"> (V60, </w:t>
+      </w:r>
+      <w:proofErr w:type="spellStart"/>
+      <w:r>
+        <w:rPr>
+          <w:b/>
+          <w:bCs/>
+          <w:lang w:val="es-419" w:eastAsia="es-CO"/>
+        </w:rPr>
+        <w:t>Chemex</w:t>
+      </w:r>
+      <w:proofErr w:type="spellEnd"/>
+      <w:r>
+        <w:rPr>
+          <w:b/>
+          <w:bCs/>
+          <w:lang w:val="es-419" w:eastAsia="es-CO"/>
+        </w:rPr>
+        <w:t xml:space="preserve">, </w:t>
+      </w:r>
+      <w:proofErr w:type="spellStart"/>
+      <w:r>
+        <w:rPr>
+          <w:b/>
+          <w:bCs/>
+          <w:lang w:val="es-419" w:eastAsia="es-CO"/>
+        </w:rPr>
+        <w:t>Kalita</w:t>
+      </w:r>
+      <w:proofErr w:type="spellEnd"/>
+      <w:r>
+        <w:rPr>
+          <w:b/>
+          <w:bCs/>
+          <w:lang w:val="es-419" w:eastAsia="es-CO"/>
+        </w:rPr>
+        <w:t xml:space="preserve"> Wave)</w:t>
       </w:r>
       <w:r>
         <w:rPr>
@@ -8346,6 +8891,7 @@
           <w:lang w:val="es-419" w:eastAsia="es-CO"/>
         </w:rPr>
       </w:pPr>
+      <w:proofErr w:type="spellStart"/>
       <w:r>
         <w:rPr>
           <w:b/>
@@ -8354,6 +8900,7 @@
         </w:rPr>
         <w:t>Aeropress</w:t>
       </w:r>
+      <w:proofErr w:type="spellEnd"/>
       <w:r>
         <w:rPr>
           <w:lang w:val="es-419" w:eastAsia="es-CO"/>
@@ -8539,8 +9086,13 @@
             <w:pPr>
               <w:pStyle w:val="TextoTablas"/>
             </w:pPr>
-            <w:r>
-              <w:t>Portafiltro y cesta</w:t>
+            <w:proofErr w:type="spellStart"/>
+            <w:r>
+              <w:t>Portafiltro</w:t>
+            </w:r>
+            <w:proofErr w:type="spellEnd"/>
+            <w:r>
+              <w:t xml:space="preserve"> y cesta</w:t>
             </w:r>
           </w:p>
         </w:tc>
@@ -9145,6 +9697,7 @@
         </w:rPr>
         <w:t xml:space="preserve">Procedimiento de </w:t>
       </w:r>
+      <w:proofErr w:type="spellStart"/>
       <w:r>
         <w:rPr>
           <w:rStyle w:val="Extranjerismo"/>
@@ -9154,6 +9707,7 @@
         </w:rPr>
         <w:t>backflush</w:t>
       </w:r>
+      <w:proofErr w:type="spellEnd"/>
       <w:r>
         <w:rPr>
           <w:b/>
@@ -9186,8 +9740,16 @@
         <w:rPr>
           <w:lang w:val="es-419" w:eastAsia="es-CO"/>
         </w:rPr>
-        <w:t>Preparar el portafiltro</w:t>
-      </w:r>
+        <w:t xml:space="preserve">Preparar el </w:t>
+      </w:r>
+      <w:proofErr w:type="spellStart"/>
+      <w:r>
+        <w:rPr>
+          <w:lang w:val="es-419" w:eastAsia="es-CO"/>
+        </w:rPr>
+        <w:t>portafiltro</w:t>
+      </w:r>
+      <w:proofErr w:type="spellEnd"/>
       <w:r>
         <w:rPr>
           <w:lang w:val="es-419" w:eastAsia="es-CO"/>
@@ -9198,7 +9760,21 @@
         <w:rPr>
           <w:lang w:val="es-419" w:eastAsia="es-CO"/>
         </w:rPr>
-        <w:t>Retirar la cesta del portafiltro y colocar el disco ciego.</w:t>
+        <w:t xml:space="preserve">Retirar la cesta del </w:t>
+      </w:r>
+      <w:proofErr w:type="spellStart"/>
+      <w:r>
+        <w:rPr>
+          <w:lang w:val="es-419" w:eastAsia="es-CO"/>
+        </w:rPr>
+        <w:t>portafiltro</w:t>
+      </w:r>
+      <w:proofErr w:type="spellEnd"/>
+      <w:r>
+        <w:rPr>
+          <w:lang w:val="es-419" w:eastAsia="es-CO"/>
+        </w:rPr>
+        <w:t xml:space="preserve"> y colocar el disco ciego.</w:t>
       </w:r>
     </w:p>
     <w:p>
@@ -9228,7 +9804,21 @@
         <w:rPr>
           <w:lang w:val="es-419" w:eastAsia="es-CO"/>
         </w:rPr>
-        <w:t>Agregar 1-2 g de detergente especial (cafiza) sobre el disco.</w:t>
+        <w:t>Agregar 1-2 g de detergente especial (</w:t>
+      </w:r>
+      <w:proofErr w:type="spellStart"/>
+      <w:r>
+        <w:rPr>
+          <w:lang w:val="es-419" w:eastAsia="es-CO"/>
+        </w:rPr>
+        <w:t>cafiza</w:t>
+      </w:r>
+      <w:proofErr w:type="spellEnd"/>
+      <w:r>
+        <w:rPr>
+          <w:lang w:val="es-419" w:eastAsia="es-CO"/>
+        </w:rPr>
+        <w:t>) sobre el disco.</w:t>
       </w:r>
     </w:p>
     <w:p>
@@ -9248,6 +9838,7 @@
         </w:rPr>
         <w:t xml:space="preserve">Iniciar el </w:t>
       </w:r>
+      <w:proofErr w:type="spellStart"/>
       <w:r>
         <w:rPr>
           <w:rStyle w:val="Extranjerismo"/>
@@ -9255,6 +9846,7 @@
         </w:rPr>
         <w:t>backflush</w:t>
       </w:r>
+      <w:proofErr w:type="spellEnd"/>
       <w:r>
         <w:rPr>
           <w:lang w:val="es-419" w:eastAsia="es-CO"/>
@@ -9265,7 +9857,21 @@
         <w:rPr>
           <w:lang w:val="es-419" w:eastAsia="es-CO"/>
         </w:rPr>
-        <w:t>Insertar el portafiltro y accionar la bomba durante 10 s.</w:t>
+        <w:t xml:space="preserve">Insertar el </w:t>
+      </w:r>
+      <w:proofErr w:type="spellStart"/>
+      <w:r>
+        <w:rPr>
+          <w:lang w:val="es-419" w:eastAsia="es-CO"/>
+        </w:rPr>
+        <w:t>portafiltro</w:t>
+      </w:r>
+      <w:proofErr w:type="spellEnd"/>
+      <w:r>
+        <w:rPr>
+          <w:lang w:val="es-419" w:eastAsia="es-CO"/>
+        </w:rPr>
+        <w:t xml:space="preserve"> y accionar la bomba durante 10 s.</w:t>
       </w:r>
     </w:p>
     <w:p>
@@ -9314,7 +9920,15 @@
         <w:rPr>
           <w:lang w:val="es-419" w:eastAsia="es-CO"/>
         </w:rPr>
-        <w:t>Enjuague final</w:t>
+        <w:t xml:space="preserve">Enjuague </w:t>
+      </w:r>
+      <w:proofErr w:type="spellStart"/>
+      <w:proofErr w:type="gramStart"/>
+      <w:r>
+        <w:rPr>
+          <w:lang w:val="es-419" w:eastAsia="es-CO"/>
+        </w:rPr>
+        <w:t>final</w:t>
       </w:r>
       <w:r>
         <w:rPr>
@@ -9326,8 +9940,31 @@
         <w:rPr>
           <w:lang w:val="es-419" w:eastAsia="es-CO"/>
         </w:rPr>
-        <w:t xml:space="preserve">Retirar el portafiltro, enjuagar y realizar 3 ciclos de </w:t>
-      </w:r>
+        <w:t>Retirar</w:t>
+      </w:r>
+      <w:proofErr w:type="spellEnd"/>
+      <w:proofErr w:type="gramEnd"/>
+      <w:r>
+        <w:rPr>
+          <w:lang w:val="es-419" w:eastAsia="es-CO"/>
+        </w:rPr>
+        <w:t xml:space="preserve"> el </w:t>
+      </w:r>
+      <w:proofErr w:type="spellStart"/>
+      <w:r>
+        <w:rPr>
+          <w:lang w:val="es-419" w:eastAsia="es-CO"/>
+        </w:rPr>
+        <w:t>portafiltro</w:t>
+      </w:r>
+      <w:proofErr w:type="spellEnd"/>
+      <w:r>
+        <w:rPr>
+          <w:lang w:val="es-419" w:eastAsia="es-CO"/>
+        </w:rPr>
+        <w:t xml:space="preserve">, enjuagar y realizar 3 ciclos de </w:t>
+      </w:r>
+      <w:proofErr w:type="spellStart"/>
       <w:r>
         <w:rPr>
           <w:rStyle w:val="Extranjerismo"/>
@@ -9335,6 +9972,7 @@
         </w:rPr>
         <w:t>backflush</w:t>
       </w:r>
+      <w:proofErr w:type="spellEnd"/>
       <w:r>
         <w:rPr>
           <w:lang w:val="es-419" w:eastAsia="es-CO"/>
@@ -9421,13 +10059,31 @@
         </w:rPr>
         <w:t>La elección del método de extracción no es arbitraria; cada método resalta atributos diferentes de un mismo lote de café. Por ejemplo, un café con notas florales y cítricas brillará más en un método de vertido (</w:t>
       </w:r>
+      <w:proofErr w:type="spellStart"/>
       <w:r>
         <w:rPr>
           <w:rStyle w:val="Extranjerismo"/>
           <w:lang w:val="es-419" w:eastAsia="es-CO"/>
         </w:rPr>
-        <w:t>pour over</w:t>
-      </w:r>
+        <w:t>pour</w:t>
+      </w:r>
+      <w:proofErr w:type="spellEnd"/>
+      <w:r>
+        <w:rPr>
+          <w:rStyle w:val="Extranjerismo"/>
+          <w:lang w:val="es-419" w:eastAsia="es-CO"/>
+        </w:rPr>
+        <w:t xml:space="preserve"> </w:t>
+      </w:r>
+      <w:proofErr w:type="spellStart"/>
+      <w:r>
+        <w:rPr>
+          <w:rStyle w:val="Extranjerismo"/>
+          <w:lang w:val="es-419" w:eastAsia="es-CO"/>
+        </w:rPr>
+        <w:t>over</w:t>
+      </w:r>
+      <w:proofErr w:type="spellEnd"/>
       <w:r>
         <w:rPr>
           <w:lang w:val="es-419" w:eastAsia="es-CO"/>
@@ -9462,7 +10118,21 @@
         <w:rPr>
           <w:lang w:val="es-419" w:eastAsia="es-CO"/>
         </w:rPr>
-        <w:t xml:space="preserve">como en Aeropress, e incluso en una cafetera </w:t>
+        <w:t xml:space="preserve">como en </w:t>
+      </w:r>
+      <w:proofErr w:type="spellStart"/>
+      <w:r>
+        <w:rPr>
+          <w:lang w:val="es-419" w:eastAsia="es-CO"/>
+        </w:rPr>
+        <w:t>Aeropress</w:t>
+      </w:r>
+      <w:proofErr w:type="spellEnd"/>
+      <w:r>
+        <w:rPr>
+          <w:lang w:val="es-419" w:eastAsia="es-CO"/>
+        </w:rPr>
+        <w:t xml:space="preserve">, e incluso en una cafetera </w:t>
       </w:r>
       <w:r>
         <w:rPr>
@@ -9659,7 +10329,21 @@
         <w:rPr>
           <w:lang w:val="es-419" w:eastAsia="es-CO"/>
         </w:rPr>
-        <w:t>: encienda la máquina 20-30 minutos antes. Purge el grupo durante 2-3 segundos.</w:t>
+        <w:t xml:space="preserve">: encienda la máquina 20-30 minutos antes. </w:t>
+      </w:r>
+      <w:proofErr w:type="spellStart"/>
+      <w:r>
+        <w:rPr>
+          <w:lang w:val="es-419" w:eastAsia="es-CO"/>
+        </w:rPr>
+        <w:t>Purge</w:t>
+      </w:r>
+      <w:proofErr w:type="spellEnd"/>
+      <w:r>
+        <w:rPr>
+          <w:lang w:val="es-419" w:eastAsia="es-CO"/>
+        </w:rPr>
+        <w:t xml:space="preserve"> el grupo durante 2-3 segundos.</w:t>
       </w:r>
     </w:p>
     <w:p>
@@ -9679,13 +10363,37 @@
           <w:bCs/>
           <w:lang w:val="es-419" w:eastAsia="es-CO"/>
         </w:rPr>
-        <w:t>Moler y dosar</w:t>
-      </w:r>
-      <w:r>
-        <w:rPr>
-          <w:lang w:val="es-419" w:eastAsia="es-CO"/>
-        </w:rPr>
-        <w:t>: muela la cantidad exacta (use balanza) en el portafiltro. Nivele la superficie con el dedo o con un distribuidor.</w:t>
+        <w:t xml:space="preserve">Moler y </w:t>
+      </w:r>
+      <w:proofErr w:type="spellStart"/>
+      <w:r>
+        <w:rPr>
+          <w:b/>
+          <w:bCs/>
+          <w:lang w:val="es-419" w:eastAsia="es-CO"/>
+        </w:rPr>
+        <w:t>dosar</w:t>
+      </w:r>
+      <w:proofErr w:type="spellEnd"/>
+      <w:r>
+        <w:rPr>
+          <w:lang w:val="es-419" w:eastAsia="es-CO"/>
+        </w:rPr>
+        <w:t xml:space="preserve">: muela la cantidad exacta (use balanza) en el </w:t>
+      </w:r>
+      <w:proofErr w:type="spellStart"/>
+      <w:r>
+        <w:rPr>
+          <w:lang w:val="es-419" w:eastAsia="es-CO"/>
+        </w:rPr>
+        <w:t>portafiltro</w:t>
+      </w:r>
+      <w:proofErr w:type="spellEnd"/>
+      <w:r>
+        <w:rPr>
+          <w:lang w:val="es-419" w:eastAsia="es-CO"/>
+        </w:rPr>
+        <w:t>. Nivele la superficie con el dedo o con un distribuidor.</w:t>
       </w:r>
     </w:p>
     <w:p>
@@ -9705,7 +10413,25 @@
           <w:bCs/>
           <w:lang w:val="es-419" w:eastAsia="es-CO"/>
         </w:rPr>
-        <w:t>Apisonar (tampeo)</w:t>
+        <w:t>Apisonar (</w:t>
+      </w:r>
+      <w:proofErr w:type="spellStart"/>
+      <w:r>
+        <w:rPr>
+          <w:b/>
+          <w:bCs/>
+          <w:lang w:val="es-419" w:eastAsia="es-CO"/>
+        </w:rPr>
+        <w:t>tampeo</w:t>
+      </w:r>
+      <w:proofErr w:type="spellEnd"/>
+      <w:r>
+        <w:rPr>
+          <w:b/>
+          <w:bCs/>
+          <w:lang w:val="es-419" w:eastAsia="es-CO"/>
+        </w:rPr>
+        <w:t>)</w:t>
       </w:r>
       <w:r>
         <w:rPr>
@@ -9737,7 +10463,21 @@
         <w:rPr>
           <w:lang w:val="es-419" w:eastAsia="es-CO"/>
         </w:rPr>
-        <w:t>: deje correr agua 1-2 segundos antes de insertar el portafiltro para eliminar posos residuales y estabilizar la temperatura.</w:t>
+        <w:t xml:space="preserve">: deje correr agua 1-2 segundos antes de insertar el </w:t>
+      </w:r>
+      <w:proofErr w:type="spellStart"/>
+      <w:r>
+        <w:rPr>
+          <w:lang w:val="es-419" w:eastAsia="es-CO"/>
+        </w:rPr>
+        <w:t>portafiltro</w:t>
+      </w:r>
+      <w:proofErr w:type="spellEnd"/>
+      <w:r>
+        <w:rPr>
+          <w:lang w:val="es-419" w:eastAsia="es-CO"/>
+        </w:rPr>
+        <w:t xml:space="preserve"> para eliminar posos residuales y estabilizar la temperatura.</w:t>
       </w:r>
     </w:p>
     <w:p>
@@ -9765,6 +10505,7 @@
         </w:rPr>
         <w:t>: inicie la bomba. Las primeras gotas deben aparecer entre 4-6 segundos. El flujo debe ser constante, como "cola de ratón". Detenga la extracción cuando alcance los 36 g (en balanza) o al observar aclaramiento de la crema (</w:t>
       </w:r>
+      <w:proofErr w:type="spellStart"/>
       <w:r>
         <w:rPr>
           <w:rStyle w:val="Extranjerismo"/>
@@ -9772,6 +10513,7 @@
         </w:rPr>
         <w:t>blonde</w:t>
       </w:r>
+      <w:proofErr w:type="spellEnd"/>
       <w:r>
         <w:rPr>
           <w:lang w:val="es-419" w:eastAsia="es-CO"/>
@@ -10053,8 +10795,13 @@
               <w:pStyle w:val="TextoTablas"/>
             </w:pPr>
             <w:r>
-              <w:t>Ajustar molienda y dosis; usar café reposado 5-10 días post-tostón</w:t>
-            </w:r>
+              <w:t xml:space="preserve">Ajustar molienda y dosis; usar café reposado 5-10 días </w:t>
+            </w:r>
+            <w:proofErr w:type="spellStart"/>
+            <w:r>
+              <w:t>post-tostón</w:t>
+            </w:r>
+            <w:proofErr w:type="spellEnd"/>
           </w:p>
         </w:tc>
       </w:tr>
@@ -10132,6 +10879,7 @@
         </w:rPr>
         <w:t>Métodos de goteo (</w:t>
       </w:r>
+      <w:proofErr w:type="spellStart"/>
       <w:r>
         <w:rPr>
           <w:rStyle w:val="Extranjerismo"/>
@@ -10139,38 +10887,87 @@
           <w:bCs/>
           <w:lang w:val="es-419" w:eastAsia="es-CO"/>
         </w:rPr>
-        <w:t>pour over</w:t>
-      </w:r>
-      <w:r>
-        <w:rPr>
-          <w:b/>
-          <w:bCs/>
-          <w:lang w:val="es-419" w:eastAsia="es-CO"/>
-        </w:rPr>
-        <w:t>): V60, Chemex</w:t>
-      </w:r>
-      <w:r>
-        <w:rPr>
+        <w:t>pour</w:t>
+      </w:r>
+      <w:proofErr w:type="spellEnd"/>
+      <w:r>
+        <w:rPr>
+          <w:rStyle w:val="Extranjerismo"/>
           <w:b/>
           <w:bCs/>
           <w:lang w:val="es-419" w:eastAsia="es-CO"/>
         </w:rPr>
         <w:t xml:space="preserve"> </w:t>
       </w:r>
-    </w:p>
-    <w:p>
-      <w:pPr>
-        <w:rPr>
-          <w:lang w:val="es-419" w:eastAsia="es-CO"/>
-        </w:rPr>
-      </w:pPr>
-      <w:r>
-        <w:rPr>
-          <w:b/>
-          <w:bCs/>
-          <w:lang w:val="es-419" w:eastAsia="es-CO"/>
-        </w:rPr>
-        <w:t>V60 (Hario):</w:t>
+      <w:proofErr w:type="spellStart"/>
+      <w:r>
+        <w:rPr>
+          <w:rStyle w:val="Extranjerismo"/>
+          <w:b/>
+          <w:bCs/>
+          <w:lang w:val="es-419" w:eastAsia="es-CO"/>
+        </w:rPr>
+        <w:t>over</w:t>
+      </w:r>
+      <w:proofErr w:type="spellEnd"/>
+      <w:r>
+        <w:rPr>
+          <w:b/>
+          <w:bCs/>
+          <w:lang w:val="es-419" w:eastAsia="es-CO"/>
+        </w:rPr>
+        <w:t xml:space="preserve">): V60, </w:t>
+      </w:r>
+      <w:proofErr w:type="spellStart"/>
+      <w:r>
+        <w:rPr>
+          <w:b/>
+          <w:bCs/>
+          <w:lang w:val="es-419" w:eastAsia="es-CO"/>
+        </w:rPr>
+        <w:t>Chemex</w:t>
+      </w:r>
+      <w:proofErr w:type="spellEnd"/>
+      <w:r>
+        <w:rPr>
+          <w:b/>
+          <w:bCs/>
+          <w:lang w:val="es-419" w:eastAsia="es-CO"/>
+        </w:rPr>
+        <w:t xml:space="preserve"> </w:t>
+      </w:r>
+    </w:p>
+    <w:p>
+      <w:pPr>
+        <w:rPr>
+          <w:lang w:val="es-419" w:eastAsia="es-CO"/>
+        </w:rPr>
+      </w:pPr>
+      <w:r>
+        <w:rPr>
+          <w:b/>
+          <w:bCs/>
+          <w:lang w:val="es-419" w:eastAsia="es-CO"/>
+        </w:rPr>
+        <w:t>V60 (</w:t>
+      </w:r>
+      <w:proofErr w:type="spellStart"/>
+      <w:r>
+        <w:rPr>
+          <w:b/>
+          <w:bCs/>
+          <w:lang w:val="es-419" w:eastAsia="es-CO"/>
+        </w:rPr>
+        <w:t>Hario</w:t>
+      </w:r>
+      <w:proofErr w:type="spellEnd"/>
+      <w:r>
+        <w:rPr>
+          <w:b/>
+          <w:bCs/>
+          <w:lang w:val="es-419" w:eastAsia="es-CO"/>
+        </w:rPr>
+        <w:t>):</w:t>
       </w:r>
     </w:p>
     <w:p>
@@ -10188,7 +10985,21 @@
         <w:rPr>
           <w:lang w:val="es-419" w:eastAsia="es-CO"/>
         </w:rPr>
-        <w:t>Molienda: media-fina (500-700 μm, similar a azúcar morena).</w:t>
+        <w:t xml:space="preserve">Molienda: media-fina (500-700 </w:t>
+      </w:r>
+      <w:proofErr w:type="spellStart"/>
+      <w:r>
+        <w:rPr>
+          <w:lang w:val="es-419" w:eastAsia="es-CO"/>
+        </w:rPr>
+        <w:t>μm</w:t>
+      </w:r>
+      <w:proofErr w:type="spellEnd"/>
+      <w:r>
+        <w:rPr>
+          <w:lang w:val="es-419" w:eastAsia="es-CO"/>
+        </w:rPr>
+        <w:t>, similar a azúcar morena).</w:t>
       </w:r>
     </w:p>
     <w:p>
@@ -10291,13 +11102,22 @@
           <w:lang w:val="es-419" w:eastAsia="es-CO"/>
         </w:rPr>
       </w:pPr>
+      <w:proofErr w:type="spellStart"/>
       <w:r>
         <w:rPr>
           <w:lang w:val="es-419" w:eastAsia="es-CO"/>
         </w:rPr>
         <w:lastRenderedPageBreak/>
-        <w:t>Preinfusión (</w:t>
-      </w:r>
+        <w:t>Preinfusión</w:t>
+      </w:r>
+      <w:proofErr w:type="spellEnd"/>
+      <w:r>
+        <w:rPr>
+          <w:lang w:val="es-419" w:eastAsia="es-CO"/>
+        </w:rPr>
+        <w:t xml:space="preserve"> (</w:t>
+      </w:r>
+      <w:proofErr w:type="spellStart"/>
       <w:r>
         <w:rPr>
           <w:rStyle w:val="Extranjerismo"/>
@@ -10305,6 +11125,7 @@
         </w:rPr>
         <w:t>bloom</w:t>
       </w:r>
+      <w:proofErr w:type="spellEnd"/>
       <w:r>
         <w:rPr>
           <w:lang w:val="es-419" w:eastAsia="es-CO"/>
@@ -10356,13 +11177,23 @@
           <w:lang w:val="es-419" w:eastAsia="es-CO"/>
         </w:rPr>
       </w:pPr>
-      <w:r>
-        <w:rPr>
-          <w:b/>
-          <w:bCs/>
-          <w:lang w:val="es-419" w:eastAsia="es-CO"/>
-        </w:rPr>
-        <w:t>Chemex:</w:t>
+      <w:proofErr w:type="spellStart"/>
+      <w:r>
+        <w:rPr>
+          <w:b/>
+          <w:bCs/>
+          <w:lang w:val="es-419" w:eastAsia="es-CO"/>
+        </w:rPr>
+        <w:t>Chemex</w:t>
+      </w:r>
+      <w:proofErr w:type="spellEnd"/>
+      <w:r>
+        <w:rPr>
+          <w:b/>
+          <w:bCs/>
+          <w:lang w:val="es-419" w:eastAsia="es-CO"/>
+        </w:rPr>
+        <w:t>:</w:t>
       </w:r>
     </w:p>
     <w:p>
@@ -10380,7 +11211,21 @@
         <w:rPr>
           <w:lang w:val="es-419" w:eastAsia="es-CO"/>
         </w:rPr>
-        <w:t>Similar a V60, pero con filtro más grueso y molienda ligeramente más gruesa (media: 700-900 μm).</w:t>
+        <w:t xml:space="preserve">Similar a V60, pero con filtro más grueso y molienda ligeramente más gruesa (media: 700-900 </w:t>
+      </w:r>
+      <w:proofErr w:type="spellStart"/>
+      <w:r>
+        <w:rPr>
+          <w:lang w:val="es-419" w:eastAsia="es-CO"/>
+        </w:rPr>
+        <w:t>μm</w:t>
+      </w:r>
+      <w:proofErr w:type="spellEnd"/>
+      <w:r>
+        <w:rPr>
+          <w:lang w:val="es-419" w:eastAsia="es-CO"/>
+        </w:rPr>
+        <w:t>).</w:t>
       </w:r>
     </w:p>
     <w:p>
@@ -10433,7 +11278,21 @@
         <w:rPr>
           <w:lang w:val="es-419" w:eastAsia="es-CO"/>
         </w:rPr>
-        <w:t>Molienda: gruesa (1000-1200 μm, como pan rallado).</w:t>
+        <w:t xml:space="preserve">Molienda: gruesa (1000-1200 </w:t>
+      </w:r>
+      <w:proofErr w:type="spellStart"/>
+      <w:r>
+        <w:rPr>
+          <w:lang w:val="es-419" w:eastAsia="es-CO"/>
+        </w:rPr>
+        <w:t>μm</w:t>
+      </w:r>
+      <w:proofErr w:type="spellEnd"/>
+      <w:r>
+        <w:rPr>
+          <w:lang w:val="es-419" w:eastAsia="es-CO"/>
+        </w:rPr>
+        <w:t>, como pan rallado).</w:t>
       </w:r>
     </w:p>
     <w:p>
@@ -10598,6 +11457,7 @@
           <w:lang w:val="es-419" w:eastAsia="es-CO"/>
         </w:rPr>
       </w:pPr>
+      <w:proofErr w:type="spellStart"/>
       <w:r>
         <w:rPr>
           <w:b/>
@@ -10605,7 +11465,16 @@
           <w:lang w:val="es-419" w:eastAsia="es-CO"/>
         </w:rPr>
         <w:lastRenderedPageBreak/>
-        <w:t>Aeropress: versatilidad y control de variables</w:t>
+        <w:t>Aeropress</w:t>
+      </w:r>
+      <w:proofErr w:type="spellEnd"/>
+      <w:r>
+        <w:rPr>
+          <w:b/>
+          <w:bCs/>
+          <w:lang w:val="es-419" w:eastAsia="es-CO"/>
+        </w:rPr>
+        <w:t>: versatilidad y control de variables</w:t>
       </w:r>
     </w:p>
     <w:p>
@@ -11254,9 +12123,11 @@
             <w:pPr>
               <w:pStyle w:val="TextoTablas"/>
             </w:pPr>
+            <w:proofErr w:type="spellStart"/>
             <w:r>
               <w:t>Chemex</w:t>
             </w:r>
+            <w:proofErr w:type="spellEnd"/>
           </w:p>
         </w:tc>
         <w:tc>
@@ -11417,9 +12288,11 @@
             <w:pPr>
               <w:pStyle w:val="TextoTablas"/>
             </w:pPr>
+            <w:proofErr w:type="spellStart"/>
             <w:r>
               <w:t>Aeropress</w:t>
             </w:r>
+            <w:proofErr w:type="spellEnd"/>
           </w:p>
         </w:tc>
         <w:tc>
@@ -11745,6 +12618,7 @@
         </w:rPr>
         <w:t xml:space="preserve">El cremado de leche es una de las habilidades más visibles del barista. No solo añade textura y dulzura a las bebidas con leche (capuchino, </w:t>
       </w:r>
+      <w:proofErr w:type="spellStart"/>
       <w:r>
         <w:rPr>
           <w:rStyle w:val="Extranjerismo"/>
@@ -11752,6 +12626,7 @@
         </w:rPr>
         <w:t>latte</w:t>
       </w:r>
+      <w:proofErr w:type="spellEnd"/>
       <w:r>
         <w:rPr>
           <w:lang w:val="es-419" w:eastAsia="es-CO"/>
@@ -11763,14 +12638,24 @@
           <w:rStyle w:val="Extranjerismo"/>
           <w:lang w:val="es-419" w:eastAsia="es-CO"/>
         </w:rPr>
-        <w:t>flat white</w:t>
-      </w:r>
+        <w:t xml:space="preserve">flat </w:t>
+      </w:r>
+      <w:proofErr w:type="spellStart"/>
+      <w:r>
+        <w:rPr>
+          <w:rStyle w:val="Extranjerismo"/>
+          <w:lang w:val="es-419" w:eastAsia="es-CO"/>
+        </w:rPr>
+        <w:t>white</w:t>
+      </w:r>
+      <w:proofErr w:type="spellEnd"/>
       <w:r>
         <w:rPr>
           <w:lang w:val="es-419" w:eastAsia="es-CO"/>
         </w:rPr>
         <w:t xml:space="preserve">), sino que también permite la creación de arte </w:t>
       </w:r>
+      <w:proofErr w:type="spellStart"/>
       <w:r>
         <w:rPr>
           <w:rStyle w:val="Extranjerismo"/>
@@ -11778,6 +12663,7 @@
         </w:rPr>
         <w:t>latte</w:t>
       </w:r>
+      <w:proofErr w:type="spellEnd"/>
       <w:r>
         <w:rPr>
           <w:lang w:val="es-419" w:eastAsia="es-CO"/>
@@ -12019,6 +12905,7 @@
         </w:rPr>
         <w:t>Fase de estiramiento (</w:t>
       </w:r>
+      <w:proofErr w:type="spellStart"/>
       <w:r>
         <w:rPr>
           <w:rStyle w:val="Extranjerismo"/>
@@ -12026,6 +12913,7 @@
         </w:rPr>
         <w:t>stretch</w:t>
       </w:r>
+      <w:proofErr w:type="spellEnd"/>
       <w:r>
         <w:rPr>
           <w:lang w:val="es-419" w:eastAsia="es-CO"/>
@@ -12415,6 +13303,7 @@
         </w:rPr>
         <w:t xml:space="preserve">Vertido básico y figuras elementales del arte </w:t>
       </w:r>
+      <w:proofErr w:type="spellStart"/>
       <w:r>
         <w:rPr>
           <w:rStyle w:val="Extranjerismo"/>
@@ -12424,6 +13313,7 @@
         </w:rPr>
         <w:t>latte</w:t>
       </w:r>
+      <w:proofErr w:type="spellEnd"/>
     </w:p>
     <w:p>
       <w:pPr>
@@ -12437,6 +13327,7 @@
         </w:rPr>
         <w:t xml:space="preserve">El arte </w:t>
       </w:r>
+      <w:proofErr w:type="spellStart"/>
       <w:r>
         <w:rPr>
           <w:rStyle w:val="Extranjerismo"/>
@@ -12444,18 +13335,28 @@
         </w:rPr>
         <w:t>latte</w:t>
       </w:r>
+      <w:proofErr w:type="spellEnd"/>
       <w:r>
         <w:rPr>
           <w:lang w:val="es-419" w:eastAsia="es-CO"/>
         </w:rPr>
         <w:t xml:space="preserve">, o </w:t>
       </w:r>
+      <w:proofErr w:type="spellStart"/>
       <w:r>
         <w:rPr>
           <w:rStyle w:val="Extranjerismo"/>
           <w:lang w:val="es-419" w:eastAsia="es-CO"/>
         </w:rPr>
-        <w:t>latte art</w:t>
+        <w:t>latte</w:t>
+      </w:r>
+      <w:proofErr w:type="spellEnd"/>
+      <w:r>
+        <w:rPr>
+          <w:rStyle w:val="Extranjerismo"/>
+          <w:lang w:val="es-419" w:eastAsia="es-CO"/>
+        </w:rPr>
+        <w:t xml:space="preserve"> art</w:t>
       </w:r>
       <w:r>
         <w:rPr>
@@ -12463,6 +13364,7 @@
         </w:rPr>
         <w:t xml:space="preserve">, no es un adorno superficial, sino la culminación visible de una técnica de cremado perfecta y la prueba de que la leche ha sido texturizada con precisión. Lejos de ser un simple "dibujo", cada figura refleja la correcta emulsión de la leche y la maestría en el manejo de la jarra. Aunque se debate su origen exacto, el arte </w:t>
       </w:r>
+      <w:proofErr w:type="spellStart"/>
       <w:r>
         <w:rPr>
           <w:rStyle w:val="Extranjerismo"/>
@@ -12470,11 +13372,26 @@
         </w:rPr>
         <w:t>latte</w:t>
       </w:r>
-      <w:r>
-        <w:rPr>
-          <w:lang w:val="es-419" w:eastAsia="es-CO"/>
-        </w:rPr>
-        <w:t xml:space="preserve"> moderno nació en la cultura del café de especialidad de Estados Unidos a finales de los años ochenta. Baristas como David Schomer, de </w:t>
+      <w:proofErr w:type="spellEnd"/>
+      <w:r>
+        <w:rPr>
+          <w:lang w:val="es-419" w:eastAsia="es-CO"/>
+        </w:rPr>
+        <w:t xml:space="preserve"> moderno nació en la cultura del café de especialidad de Estados Unidos a finales de los años ochenta. Baristas como David </w:t>
+      </w:r>
+      <w:proofErr w:type="spellStart"/>
+      <w:r>
+        <w:rPr>
+          <w:lang w:val="es-419" w:eastAsia="es-CO"/>
+        </w:rPr>
+        <w:t>Schomer</w:t>
+      </w:r>
+      <w:proofErr w:type="spellEnd"/>
+      <w:r>
+        <w:rPr>
+          <w:lang w:val="es-419" w:eastAsia="es-CO"/>
+        </w:rPr>
+        <w:t xml:space="preserve">, de </w:t>
       </w:r>
       <w:r>
         <w:rPr>
@@ -12499,7 +13416,21 @@
         <w:rPr>
           <w:lang w:val="es-419" w:eastAsia="es-CO"/>
         </w:rPr>
-        <w:t xml:space="preserve">El corazón es la primera figura que un barista debe dominar. Su ejecución no depende de movimientos complejos, sino de un control absoluto del caudal y la altura del vertido. Se requiere una leche con microespuma sedosa y brillante. Su nombre no es casual: su forma redonda y simétrica representa la perfección del punto de vertido y la estabilidad de la emulsión. En la cultura del café, un corazón bien definido es el sello de un barista que ha interiorizado los fundamentos del cremado. Para lograrlo, se vierte desde altura media hasta llenar dos tercios de la taza, luego se acerca la jarra a la </w:t>
+        <w:t xml:space="preserve">El corazón es la primera figura que un barista debe dominar. Su ejecución no depende de movimientos complejos, sino de un control absoluto del caudal y la altura del vertido. Se requiere una leche con </w:t>
+      </w:r>
+      <w:proofErr w:type="spellStart"/>
+      <w:r>
+        <w:rPr>
+          <w:lang w:val="es-419" w:eastAsia="es-CO"/>
+        </w:rPr>
+        <w:t>microespuma</w:t>
+      </w:r>
+      <w:proofErr w:type="spellEnd"/>
+      <w:r>
+        <w:rPr>
+          <w:lang w:val="es-419" w:eastAsia="es-CO"/>
+        </w:rPr>
+        <w:t xml:space="preserve"> sedosa y brillante. Su nombre no es casual: su forma redonda y simétrica representa la perfección del punto de vertido y la estabilidad de la emulsión. En la cultura del café, un corazón bien definido es el sello de un barista que ha interiorizado los fundamentos del cremado. Para lograrlo, se vierte desde altura media hasta llenar dos tercios de la taza, luego se acerca la jarra a la </w:t>
       </w:r>
       <w:r>
         <w:rPr>
@@ -12534,6 +13465,7 @@
         </w:rPr>
         <w:t xml:space="preserve">Explore los siguientes videos y descubra cómo realizar los diseños más representativos del arte </w:t>
       </w:r>
+      <w:proofErr w:type="spellStart"/>
       <w:r>
         <w:rPr>
           <w:rStyle w:val="Extranjerismo"/>
@@ -12541,12 +13473,14 @@
         </w:rPr>
         <w:t>latte</w:t>
       </w:r>
+      <w:proofErr w:type="spellEnd"/>
       <w:r>
         <w:rPr>
           <w:lang w:val="es-419" w:eastAsia="es-CO"/>
         </w:rPr>
         <w:t xml:space="preserve">: el corazón y la </w:t>
       </w:r>
+      <w:proofErr w:type="spellStart"/>
       <w:r>
         <w:rPr>
           <w:rStyle w:val="Extranjerismo"/>
@@ -12554,6 +13488,7 @@
         </w:rPr>
         <w:t>rosetta</w:t>
       </w:r>
+      <w:proofErr w:type="spellEnd"/>
       <w:r>
         <w:rPr>
           <w:lang w:val="es-419" w:eastAsia="es-CO"/>
@@ -12629,7 +13564,21 @@
         <w:rPr>
           <w:lang w:val="es-419" w:eastAsia="es-CO"/>
         </w:rPr>
-        <w:t>Un grano de café tostado es un producto perecedero. Los compuestos que le dan sabor y aroma son volátiles y se degradan rápidamente en contacto con oxígeno, luz, calor y humedad. El barista no solo debe saber preparar café, sino también almacenarlo correctamente para preservar su frescura. Este capítulo describe los factores de deterioro, los mejores métodos de almacenamiento según las investigaciones de Cenicafé y la importancia de conocer la trazabilidad y la fecha de tostión.</w:t>
+        <w:t xml:space="preserve">Un grano de café tostado es un producto perecedero. Los compuestos que le dan sabor y aroma son volátiles y se degradan rápidamente en contacto con oxígeno, luz, calor y humedad. El barista no solo debe saber preparar café, sino también almacenarlo correctamente para preservar su frescura. Este capítulo describe los factores de deterioro, los mejores métodos de almacenamiento según las investigaciones de Cenicafé y la importancia de conocer la trazabilidad y la fecha de </w:t>
+      </w:r>
+      <w:proofErr w:type="spellStart"/>
+      <w:r>
+        <w:rPr>
+          <w:lang w:val="es-419" w:eastAsia="es-CO"/>
+        </w:rPr>
+        <w:t>tostión</w:t>
+      </w:r>
+      <w:proofErr w:type="spellEnd"/>
+      <w:r>
+        <w:rPr>
+          <w:lang w:val="es-419" w:eastAsia="es-CO"/>
+        </w:rPr>
+        <w:t>.</w:t>
       </w:r>
     </w:p>
     <w:p>
@@ -12898,7 +13847,35 @@
         <w:rPr>
           <w:lang w:val="es-419" w:eastAsia="es-CO"/>
         </w:rPr>
-        <w:t>La trazabilidad permite saber el origen del café (finca, región, fecha de cosecha, fecha de tostión). El barista debe registrar la fecha de tostión de cada lote y aplicar el principio PEPS (primero en entrar, primero en salir). Un café se considera "fresco" hasta 30 días después del tostado, aunque el pico de sabor suele estar entre los días 5 y 20.</w:t>
+        <w:t xml:space="preserve">La trazabilidad permite saber el origen del café (finca, región, fecha de cosecha, fecha de </w:t>
+      </w:r>
+      <w:proofErr w:type="spellStart"/>
+      <w:r>
+        <w:rPr>
+          <w:lang w:val="es-419" w:eastAsia="es-CO"/>
+        </w:rPr>
+        <w:t>tostión</w:t>
+      </w:r>
+      <w:proofErr w:type="spellEnd"/>
+      <w:r>
+        <w:rPr>
+          <w:lang w:val="es-419" w:eastAsia="es-CO"/>
+        </w:rPr>
+        <w:t xml:space="preserve">). El barista debe registrar la fecha de </w:t>
+      </w:r>
+      <w:proofErr w:type="spellStart"/>
+      <w:r>
+        <w:rPr>
+          <w:lang w:val="es-419" w:eastAsia="es-CO"/>
+        </w:rPr>
+        <w:t>tostión</w:t>
+      </w:r>
+      <w:proofErr w:type="spellEnd"/>
+      <w:r>
+        <w:rPr>
+          <w:lang w:val="es-419" w:eastAsia="es-CO"/>
+        </w:rPr>
+        <w:t xml:space="preserve"> de cada lote y aplicar el principio PEPS (primero en entrar, primero en salir). Un café se considera "fresco" hasta 30 días después del tostado, aunque el pico de sabor suele estar entre los días 5 y 20.</w:t>
       </w:r>
     </w:p>
     <w:p>
@@ -13248,6 +14225,7 @@
         </w:rPr>
         <w:t xml:space="preserve">, los molinos a demanda, los equipos para métodos alternativos (V60, Chemex, prensa francesa, Aeropress, sifón, </w:t>
       </w:r>
+      <w:proofErr w:type="spellStart"/>
       <w:r>
         <w:rPr>
           <w:rStyle w:val="Extranjerismo"/>
@@ -13255,6 +14233,7 @@
         </w:rPr>
         <w:t>moka</w:t>
       </w:r>
+      <w:proofErr w:type="spellEnd"/>
       <w:r>
         <w:rPr>
           <w:noProof/>
@@ -13420,12 +14399,21 @@
       </w:r>
     </w:p>
     <w:p>
-      <w:r>
-        <w:rPr>
-          <w:b/>
-          <w:bCs/>
-        </w:rPr>
-        <w:t>Aeropress:</w:t>
+      <w:proofErr w:type="spellStart"/>
+      <w:r>
+        <w:rPr>
+          <w:b/>
+          <w:bCs/>
+        </w:rPr>
+        <w:t>Aeropress</w:t>
+      </w:r>
+      <w:proofErr w:type="spellEnd"/>
+      <w:r>
+        <w:rPr>
+          <w:b/>
+          <w:bCs/>
+        </w:rPr>
+        <w:t>:</w:t>
       </w:r>
       <w:r>
         <w:t xml:space="preserve"> método de preparación que combina inmersión y presión manual, de alta versatilidad.</w:t>
@@ -13442,12 +14430,14 @@
       <w:r>
         <w:t>: especie de café (</w:t>
       </w:r>
+      <w:proofErr w:type="spellStart"/>
       <w:r>
         <w:rPr>
           <w:rStyle w:val="Extranjerismo"/>
         </w:rPr>
         <w:t>coffea</w:t>
       </w:r>
+      <w:proofErr w:type="spellEnd"/>
       <w:r>
         <w:t xml:space="preserve"> arábica) valorada por su calidad sensorial superior. es la única especie cultivada en Colombia.</w:t>
       </w:r>
@@ -13489,12 +14479,21 @@
       </w:r>
     </w:p>
     <w:p>
-      <w:r>
-        <w:rPr>
-          <w:b/>
-          <w:bCs/>
-        </w:rPr>
-        <w:t>Chemex:</w:t>
+      <w:proofErr w:type="spellStart"/>
+      <w:r>
+        <w:rPr>
+          <w:b/>
+          <w:bCs/>
+        </w:rPr>
+        <w:t>Chemex</w:t>
+      </w:r>
+      <w:proofErr w:type="spellEnd"/>
+      <w:r>
+        <w:rPr>
+          <w:b/>
+          <w:bCs/>
+        </w:rPr>
+        <w:t>:</w:t>
       </w:r>
       <w:r>
         <w:t xml:space="preserve"> jarra de vidrio con filtro grueso para método de goteo.</w:t>
@@ -13551,7 +14550,15 @@
         <w:t>Cremado de leche</w:t>
       </w:r>
       <w:r>
-        <w:t>: proceso de incorporar burbujas de aire a la leche mediante vapor para crear microespuma.</w:t>
+        <w:t xml:space="preserve">: proceso de incorporar burbujas de aire a la leche mediante vapor para crear </w:t>
+      </w:r>
+      <w:proofErr w:type="spellStart"/>
+      <w:r>
+        <w:t>microespuma</w:t>
+      </w:r>
+      <w:proofErr w:type="spellEnd"/>
+      <w:r>
+        <w:t>.</w:t>
       </w:r>
     </w:p>
     <w:p>
@@ -13627,6 +14634,7 @@
       </w:r>
     </w:p>
     <w:p>
+      <w:proofErr w:type="spellStart"/>
       <w:r>
         <w:rPr>
           <w:b/>
@@ -13634,6 +14642,7 @@
         </w:rPr>
         <w:t>Microespuma</w:t>
       </w:r>
+      <w:proofErr w:type="spellEnd"/>
       <w:r>
         <w:t xml:space="preserve">: </w:t>
       </w:r>
@@ -13708,21 +14717,25 @@
       <w:r>
         <w:t>especie de café (</w:t>
       </w:r>
+      <w:proofErr w:type="spellStart"/>
       <w:r>
         <w:rPr>
           <w:rStyle w:val="Extranjerismo"/>
         </w:rPr>
         <w:t>coffea</w:t>
       </w:r>
+      <w:proofErr w:type="spellEnd"/>
       <w:r>
         <w:t xml:space="preserve"> </w:t>
       </w:r>
+      <w:proofErr w:type="spellStart"/>
       <w:r>
         <w:rPr>
           <w:rStyle w:val="Extranjerismo"/>
         </w:rPr>
         <w:t>canephora</w:t>
       </w:r>
+      <w:proofErr w:type="spellEnd"/>
       <w:r>
         <w:t>) con mayor cafeína, cuerpo pesado y menor calidad sensorial.</w:t>
       </w:r>
@@ -13741,12 +14754,28 @@
       <w:r>
         <w:t>enfermedad fúngica (</w:t>
       </w:r>
+      <w:proofErr w:type="spellStart"/>
       <w:r>
         <w:rPr>
           <w:rStyle w:val="Extranjerismo"/>
         </w:rPr>
-        <w:t>hemileia vastatrix</w:t>
-      </w:r>
+        <w:t>hemileia</w:t>
+      </w:r>
+      <w:proofErr w:type="spellEnd"/>
+      <w:r>
+        <w:rPr>
+          <w:rStyle w:val="Extranjerismo"/>
+        </w:rPr>
+        <w:t xml:space="preserve"> </w:t>
+      </w:r>
+      <w:proofErr w:type="spellStart"/>
+      <w:r>
+        <w:rPr>
+          <w:rStyle w:val="Extranjerismo"/>
+        </w:rPr>
+        <w:t>vastatrix</w:t>
+      </w:r>
+      <w:proofErr w:type="spellEnd"/>
       <w:r>
         <w:t>) que ataca las hojas. Cenicafé ha desarrollado variedades resistentes.</w:t>
       </w:r>
@@ -14212,7 +15241,13 @@
               <w:rPr>
                 <w:lang w:val="es-CO"/>
               </w:rPr>
-              <w:t xml:space="preserve"> temático</w:t>
+              <w:t xml:space="preserve"> temátic</w:t>
+            </w:r>
+            <w:r>
+              <w:rPr>
+                <w:lang w:val="es-CO"/>
+              </w:rPr>
+              <w:t>a</w:t>
             </w:r>
           </w:p>
         </w:tc>
@@ -14399,8 +15434,17 @@
                 <w:rStyle w:val="Extranjerismo"/>
                 <w:lang w:val="es-CO"/>
               </w:rPr>
-              <w:t>full stack</w:t>
-            </w:r>
+              <w:t xml:space="preserve">full </w:t>
+            </w:r>
+            <w:proofErr w:type="spellStart"/>
+            <w:r>
+              <w:rPr>
+                <w:rStyle w:val="Extranjerismo"/>
+                <w:lang w:val="es-CO"/>
+              </w:rPr>
+              <w:t>stack</w:t>
+            </w:r>
+            <w:proofErr w:type="spellEnd"/>
           </w:p>
         </w:tc>
         <w:tc>
@@ -14686,11 +15730,19 @@
                 <w:lang w:val="es-CO"/>
               </w:rPr>
             </w:pPr>
+            <w:proofErr w:type="spellStart"/>
             <w:r>
               <w:rPr>
                 <w:lang w:val="es-CO"/>
               </w:rPr>
-              <w:t xml:space="preserve">Karine Isabel Ospino Fritz  </w:t>
+              <w:t>Karine</w:t>
+            </w:r>
+            <w:proofErr w:type="spellEnd"/>
+            <w:r>
+              <w:rPr>
+                <w:lang w:val="es-CO"/>
+              </w:rPr>
+              <w:t xml:space="preserve"> Isabel Ospino Fritz  </w:t>
             </w:r>
           </w:p>
         </w:tc>
@@ -22134,6 +23186,10 @@
 </file>
 
 <file path=customXml/item1.xml><?xml version="1.0" encoding="utf-8"?>
+<b:Sources xmlns:b="http://schemas.openxmlformats.org/officeDocument/2006/bibliography" xmlns="http://schemas.openxmlformats.org/officeDocument/2006/bibliography" SelectedStyle="\APASixthEditionOfficeOnline.xsl" StyleName="APA" Version="6"/>
+</file>
+
+<file path=customXml/item2.xml><?xml version="1.0" encoding="utf-8"?>
 <?mso-contentType ?>
 <FormTemplates xmlns="http://schemas.microsoft.com/sharepoint/v3/contenttype/forms">
   <Display>DocumentLibraryForm</Display>
@@ -22142,11 +23198,18 @@
 </FormTemplates>
 </file>
 
-<file path=customXml/item2.xml><?xml version="1.0" encoding="utf-8"?>
-<b:Sources xmlns:b="http://schemas.openxmlformats.org/officeDocument/2006/bibliography" xmlns="http://schemas.openxmlformats.org/officeDocument/2006/bibliography" SelectedStyle="\APASixthEditionOfficeOnline.xsl" StyleName="APA" Version="6"/>
+<file path=customXml/item3.xml><?xml version="1.0" encoding="utf-8"?>
+<p:properties xmlns:p="http://schemas.microsoft.com/office/2006/metadata/properties" xmlns:xsi="http://www.w3.org/2001/XMLSchema-instance" xmlns:pc="http://schemas.microsoft.com/office/infopath/2007/PartnerControls">
+  <documentManagement>
+    <TaxCatchAll xmlns="67a0edcd-0de5-43ed-8c27-e32f38a00c91" xsi:nil="true"/>
+    <lcf76f155ced4ddcb4097134ff3c332f xmlns="42760c81-fd8e-4d59-8953-7cdb9f38b14f">
+      <Terms xmlns="http://schemas.microsoft.com/office/infopath/2007/PartnerControls"/>
+    </lcf76f155ced4ddcb4097134ff3c332f>
+  </documentManagement>
+</p:properties>
 </file>
 
-<file path=customXml/item3.xml><?xml version="1.0" encoding="utf-8"?>
+<file path=customXml/item4.xml><?xml version="1.0" encoding="utf-8"?>
 <ct:contentTypeSchema xmlns:ct="http://schemas.microsoft.com/office/2006/metadata/contentType" xmlns:ma="http://schemas.microsoft.com/office/2006/metadata/properties/metaAttributes" ct:_="" ma:_="" ma:contentTypeName="Documento" ma:contentTypeID="0x01010005252A1EF3BD024F856B47B579AB5244" ma:contentTypeVersion="12" ma:contentTypeDescription="Crear nuevo documento." ma:contentTypeScope="" ma:versionID="32d0e18b85ac20c34eab62df21c0cf58">
   <xsd:schema xmlns:xsd="http://www.w3.org/2001/XMLSchema" xmlns:xs="http://www.w3.org/2001/XMLSchema" xmlns:p="http://schemas.microsoft.com/office/2006/metadata/properties" xmlns:ns2="42760c81-fd8e-4d59-8953-7cdb9f38b14f" xmlns:ns3="67a0edcd-0de5-43ed-8c27-e32f38a00c91" targetNamespace="http://schemas.microsoft.com/office/2006/metadata/properties" ma:root="true" ma:fieldsID="cc2c149e99f10870fd5bc3964e5386d3" ns2:_="" ns3:_="">
     <xsd:import namespace="42760c81-fd8e-4d59-8953-7cdb9f38b14f"/>
@@ -22347,18 +23410,15 @@
 </ct:contentTypeSchema>
 </file>
 
-<file path=customXml/item4.xml><?xml version="1.0" encoding="utf-8"?>
-<p:properties xmlns:p="http://schemas.microsoft.com/office/2006/metadata/properties" xmlns:xsi="http://www.w3.org/2001/XMLSchema-instance" xmlns:pc="http://schemas.microsoft.com/office/infopath/2007/PartnerControls">
-  <documentManagement>
-    <TaxCatchAll xmlns="67a0edcd-0de5-43ed-8c27-e32f38a00c91" xsi:nil="true"/>
-    <lcf76f155ced4ddcb4097134ff3c332f xmlns="42760c81-fd8e-4d59-8953-7cdb9f38b14f">
-      <Terms xmlns="http://schemas.microsoft.com/office/infopath/2007/PartnerControls"/>
-    </lcf76f155ced4ddcb4097134ff3c332f>
-  </documentManagement>
-</p:properties>
+<file path=customXml/itemProps1.xml><?xml version="1.0" encoding="utf-8"?>
+<ds:datastoreItem xmlns:ds="http://schemas.openxmlformats.org/officeDocument/2006/customXml" ds:itemID="{EAE431FD-7059-4C09-804B-C9D69EB7B213}">
+  <ds:schemaRefs>
+    <ds:schemaRef ds:uri="http://schemas.openxmlformats.org/officeDocument/2006/bibliography"/>
+  </ds:schemaRefs>
+</ds:datastoreItem>
 </file>
 
-<file path=customXml/itemProps1.xml><?xml version="1.0" encoding="utf-8"?>
+<file path=customXml/itemProps2.xml><?xml version="1.0" encoding="utf-8"?>
 <ds:datastoreItem xmlns:ds="http://schemas.openxmlformats.org/officeDocument/2006/customXml" ds:itemID="{10663269-2064-4804-8290-36D4A57F5557}">
   <ds:schemaRefs>
     <ds:schemaRef ds:uri="http://schemas.microsoft.com/sharepoint/v3/contenttype/forms"/>
@@ -22366,15 +23426,18 @@
 </ds:datastoreItem>
 </file>
 
-<file path=customXml/itemProps2.xml><?xml version="1.0" encoding="utf-8"?>
-<ds:datastoreItem xmlns:ds="http://schemas.openxmlformats.org/officeDocument/2006/customXml" ds:itemID="{EAE431FD-7059-4C09-804B-C9D69EB7B213}">
+<file path=customXml/itemProps3.xml><?xml version="1.0" encoding="utf-8"?>
+<ds:datastoreItem xmlns:ds="http://schemas.openxmlformats.org/officeDocument/2006/customXml" ds:itemID="{1279454D-02BE-4A9C-A117-DCD1573E2608}">
   <ds:schemaRefs>
-    <ds:schemaRef ds:uri="http://schemas.openxmlformats.org/officeDocument/2006/bibliography"/>
+    <ds:schemaRef ds:uri="http://schemas.microsoft.com/office/2006/metadata/properties"/>
+    <ds:schemaRef ds:uri="http://schemas.microsoft.com/office/infopath/2007/PartnerControls"/>
+    <ds:schemaRef ds:uri="67a0edcd-0de5-43ed-8c27-e32f38a00c91"/>
+    <ds:schemaRef ds:uri="42760c81-fd8e-4d59-8953-7cdb9f38b14f"/>
   </ds:schemaRefs>
 </ds:datastoreItem>
 </file>
 
-<file path=customXml/itemProps3.xml><?xml version="1.0" encoding="utf-8"?>
+<file path=customXml/itemProps4.xml><?xml version="1.0" encoding="utf-8"?>
 <ds:datastoreItem xmlns:ds="http://schemas.openxmlformats.org/officeDocument/2006/customXml" ds:itemID="{6747B8CC-3E3E-40F9-A555-F2325CBCBF9A}">
   <ds:schemaRefs>
     <ds:schemaRef ds:uri="http://schemas.microsoft.com/office/2006/metadata/contentType"/>
@@ -22391,15 +23454,4 @@
     <ds:schemaRef ds:uri="http://schemas.microsoft.com/internal/obd"/>
   </ds:schemaRefs>
 </ds:datastoreItem>
-</file>
-
-<file path=customXml/itemProps4.xml><?xml version="1.0" encoding="utf-8"?>
-<ds:datastoreItem xmlns:ds="http://schemas.openxmlformats.org/officeDocument/2006/customXml" ds:itemID="{1279454D-02BE-4A9C-A117-DCD1573E2608}">
-  <ds:schemaRefs>
-    <ds:schemaRef ds:uri="http://schemas.microsoft.com/office/2006/metadata/properties"/>
-    <ds:schemaRef ds:uri="http://schemas.microsoft.com/office/infopath/2007/PartnerControls"/>
-    <ds:schemaRef ds:uri="67a0edcd-0de5-43ed-8c27-e32f38a00c91"/>
-    <ds:schemaRef ds:uri="42760c81-fd8e-4d59-8953-7cdb9f38b14f"/>
-  </ds:schemaRefs>
-</ds:datastoreItem>
 </file>
</xml_diff>